<commit_message>
Document the Xvfb stale-lock fix and the localhost/host.docker.internal gotcha
Two more real, live-found deployment lessons from this session that
§13's "an honest accounting" ethos should cover, since the AI-driven
crawl-coverage doc pass (949bfb4) predates both:

- The stale /tmp/.X99-lock failure mode (a408b34) — a second, distinct
  way the VNC display stack silently dies, separate from the
  missing-binary/stale-image case already documented.
- localhost/127.0.0.1 targets being unreachable from inside the
  container on Docker Desktop, generalizing the existing
  native-Postgres host.docker.internal note to any host-run target
  (DVWA, Juice Shop, etc.) — a real incident where every such target
  in an existing engagement was silently unreachable, with scans
  completing and reporting zero findings instead of visibly failing.

Co-Authored-By: Claude Sonnet 5 <noreply@anthropic.com>
Claude-Session: https://claude.ai/code/session_01MUFb1xr3BvwaLMqsqnAi7g
</commit_message>
<xml_diff>
--- a/docs/architecture-overview/Verdikt_Architecture_Document.docx
+++ b/docs/architecture-overview/Verdikt_Architecture_Document.docx
@@ -5695,6 +5695,224 @@
           <w:sz w:val="22"/>
         </w:rPr>
         <w:t xml:space="preserve"> is needed. It never fails the container outright over this — scanning, the API, and the standalone browser-extension recorder (below) don't depend on VNC at all.</w:t>
+      </w:r>
+    </w:p>
+    <w:p>
+      <w:pPr>
+        <w:pStyle w:val="ListBullet"/>
+      </w:pPr>
+      <w:r>
+        <w:rPr>
+          <w:b/>
+          <w:sz w:val="22"/>
+        </w:rPr>
+        <w:t>A second, distinct live-found VNC failure mode</w:t>
+      </w:r>
+      <w:r>
+        <w:rPr>
+          <w:sz w:val="22"/>
+        </w:rPr>
+        <w:t xml:space="preserve">: an uncleanly stopped container (an OOM kill, </w:t>
+      </w:r>
+      <w:r>
+        <w:rPr>
+          <w:rFonts w:ascii="Consolas" w:hAnsi="Consolas"/>
+          <w:color w:val="8A2BE2"/>
+          <w:sz w:val="20"/>
+        </w:rPr>
+        <w:t>exit 137</w:t>
+      </w:r>
+      <w:r>
+        <w:rPr>
+          <w:sz w:val="22"/>
+        </w:rPr>
+        <w:t xml:space="preserve"> — anything short of a graceful </w:t>
+      </w:r>
+      <w:r>
+        <w:rPr>
+          <w:rFonts w:ascii="Consolas" w:hAnsi="Consolas"/>
+          <w:color w:val="8A2BE2"/>
+          <w:sz w:val="20"/>
+        </w:rPr>
+        <w:t>SIGTERM</w:t>
+      </w:r>
+      <w:r>
+        <w:rPr>
+          <w:sz w:val="22"/>
+        </w:rPr>
+        <w:t xml:space="preserve"> </w:t>
+      </w:r>
+      <w:r>
+        <w:rPr>
+          <w:rFonts w:ascii="Consolas" w:hAnsi="Consolas"/>
+          <w:color w:val="8A2BE2"/>
+          <w:sz w:val="20"/>
+        </w:rPr>
+        <w:t>Xvfb</w:t>
+      </w:r>
+      <w:r>
+        <w:rPr>
+          <w:sz w:val="22"/>
+        </w:rPr>
+        <w:t xml:space="preserve"> gets to handle) leaves </w:t>
+      </w:r>
+      <w:r>
+        <w:rPr>
+          <w:rFonts w:ascii="Consolas" w:hAnsi="Consolas"/>
+          <w:color w:val="8A2BE2"/>
+          <w:sz w:val="20"/>
+        </w:rPr>
+        <w:t>/tmp/.X99-lock</w:t>
+      </w:r>
+      <w:r>
+        <w:rPr>
+          <w:sz w:val="22"/>
+        </w:rPr>
+        <w:t xml:space="preserve"> behind. On the next </w:t>
+      </w:r>
+      <w:r>
+        <w:rPr>
+          <w:rFonts w:ascii="Consolas" w:hAnsi="Consolas"/>
+          <w:color w:val="8A2BE2"/>
+          <w:sz w:val="20"/>
+        </w:rPr>
+        <w:t>docker compose up</w:t>
+      </w:r>
+      <w:r>
+        <w:rPr>
+          <w:sz w:val="22"/>
+        </w:rPr>
+        <w:t>/</w:t>
+      </w:r>
+      <w:r>
+        <w:rPr>
+          <w:rFonts w:ascii="Consolas" w:hAnsi="Consolas"/>
+          <w:color w:val="8A2BE2"/>
+          <w:sz w:val="20"/>
+        </w:rPr>
+        <w:t>restart</w:t>
+      </w:r>
+      <w:r>
+        <w:rPr>
+          <w:sz w:val="22"/>
+        </w:rPr>
+        <w:t xml:space="preserve"> (same container, same filesystem), </w:t>
+      </w:r>
+      <w:r>
+        <w:rPr>
+          <w:rFonts w:ascii="Consolas" w:hAnsi="Consolas"/>
+          <w:color w:val="8A2BE2"/>
+          <w:sz w:val="20"/>
+        </w:rPr>
+        <w:t>Xvfb</w:t>
+      </w:r>
+      <w:r>
+        <w:rPr>
+          <w:sz w:val="22"/>
+        </w:rPr>
+        <w:t xml:space="preserve"> sees that stale lock, assumes display </w:t>
+      </w:r>
+      <w:r>
+        <w:rPr>
+          <w:rFonts w:ascii="Consolas" w:hAnsi="Consolas"/>
+          <w:color w:val="8A2BE2"/>
+          <w:sz w:val="20"/>
+        </w:rPr>
+        <w:t>:99</w:t>
+      </w:r>
+      <w:r>
+        <w:rPr>
+          <w:sz w:val="22"/>
+        </w:rPr>
+        <w:t xml:space="preserve"> is already owned by a live server, and refuses to start — cascading into </w:t>
+      </w:r>
+      <w:r>
+        <w:rPr>
+          <w:rFonts w:ascii="Consolas" w:hAnsi="Consolas"/>
+          <w:color w:val="8A2BE2"/>
+          <w:sz w:val="20"/>
+        </w:rPr>
+        <w:t>x11vnc</w:t>
+      </w:r>
+      <w:r>
+        <w:rPr>
+          <w:sz w:val="22"/>
+        </w:rPr>
+        <w:t xml:space="preserve"> failing to connect and the whole stack reporting dead, which is what silently broke the in-app "Record macro" button. </w:t>
+      </w:r>
+      <w:r>
+        <w:rPr>
+          <w:rFonts w:ascii="Consolas" w:hAnsi="Consolas"/>
+          <w:color w:val="8A2BE2"/>
+          <w:sz w:val="20"/>
+        </w:rPr>
+        <w:t>start-display.sh</w:t>
+      </w:r>
+      <w:r>
+        <w:rPr>
+          <w:sz w:val="22"/>
+        </w:rPr>
+        <w:t xml:space="preserve"> now clears the stale lock/socket before launching </w:t>
+      </w:r>
+      <w:r>
+        <w:rPr>
+          <w:rFonts w:ascii="Consolas" w:hAnsi="Consolas"/>
+          <w:color w:val="8A2BE2"/>
+          <w:sz w:val="20"/>
+        </w:rPr>
+        <w:t>Xvfb</w:t>
+      </w:r>
+      <w:r>
+        <w:rPr>
+          <w:sz w:val="22"/>
+        </w:rPr>
+        <w:t xml:space="preserve"> and passes </w:t>
+      </w:r>
+      <w:r>
+        <w:rPr>
+          <w:rFonts w:ascii="Consolas" w:hAnsi="Consolas"/>
+          <w:color w:val="8A2BE2"/>
+          <w:sz w:val="20"/>
+        </w:rPr>
+        <w:t>-nolock</w:t>
+      </w:r>
+      <w:r>
+        <w:rPr>
+          <w:sz w:val="22"/>
+        </w:rPr>
+        <w:t xml:space="preserve"> as defense in depth.</w:t>
+      </w:r>
+    </w:p>
+    <w:p>
+      <w:pPr>
+        <w:pStyle w:val="ListBullet"/>
+      </w:pPr>
+      <w:r>
+        <w:rPr>
+          <w:b/>
+          <w:sz w:val="22"/>
+        </w:rPr>
+        <w:t>`localhost`/`127.0.0.1` targets are not reachable from inside this container</w:t>
+      </w:r>
+      <w:r>
+        <w:rPr>
+          <w:sz w:val="22"/>
+        </w:rPr>
+        <w:t xml:space="preserve"> on Docker Desktop (macOS/Windows) — it's isolated from the host's own loopback. A target/credential/traffic-import URL pointing at a host-run service (a local DVWA or Juice Shop container, say) needs </w:t>
+      </w:r>
+      <w:r>
+        <w:rPr>
+          <w:rFonts w:ascii="Consolas" w:hAnsi="Consolas"/>
+          <w:color w:val="8A2BE2"/>
+          <w:sz w:val="20"/>
+        </w:rPr>
+        <w:t>host.docker.internal</w:t>
+      </w:r>
+      <w:r>
+        <w:rPr>
+          <w:sz w:val="22"/>
+        </w:rPr>
+        <w:t xml:space="preserve"> instead, exactly like the native-Postgres override below — a real, live-found incident: every such target across an existing engagement was silently unreachable, so every scan against them ran to completion and reported zero findings with no visible error, not a connection failure.</w:t>
       </w:r>
     </w:p>
     <w:p>

</xml_diff>

<commit_message>
Bring architecture doc, deck, and replication prompt current with reality
Architecture document/presentation (.md/.html/.docx/.pptx) updated for
the Chatbot/LLM Pentest capability and CredentialSet.extra_headers:
DAG node count (31->35), model/route/check-catalog/migration/RBAC
counts corrected throughout, new appendix rows, two regenerated Mermaid
diagrams (scan DAG, data model ER), and new FAQ entries. Also caught up
a few pre-existing staleness gaps found along the way (missing
open_redirect/api_version/csp_bypass nodes and catalog entries) since
they sit right next to what was being corrected anyway.

Added REPLICATION_PROMPT.md Part C covering both features in the same
depth as the existing parts, for reproducing this work on another
checkout of the codebase.

Co-Authored-By: Claude Sonnet 5 <noreply@anthropic.com>
Claude-Session: https://claude.ai/code/session_01MUFb1xr3BvwaLMqsqnAi7g
</commit_message>
<xml_diff>
--- a/docs/architecture-overview/Verdikt_Architecture_Document.docx
+++ b/docs/architecture-overview/Verdikt_Architecture_Document.docx
@@ -64,25 +64,22 @@
     <w:p>
       <w:r>
         <w:rPr>
-          <w:color w:val="1C1E21"/>
-          <w:sz w:val="22"/>
-        </w:rPr>
-        <w:t xml:space="preserve">Verdikt is an AI-assisted, multi-agent DAST (Dynamic Application Security Testing) platform that performs manual-assessment-quality web and API penetration testing at automated speed. A single scan run executes a </w:t>
-      </w:r>
-      <w:r>
-        <w:rPr>
-          <w:b/>
-          <w:color w:val="1C1E21"/>
-          <w:sz w:val="22"/>
-        </w:rPr>
-        <w:t>31-node LangGraph DAG</w:t>
-      </w:r>
-      <w:r>
-        <w:rPr>
-          <w:color w:val="1C1E21"/>
-          <w:sz w:val="22"/>
-        </w:rPr>
-        <w:t xml:space="preserve"> covering the OWASP Top 10 (2025) and the full PortSwigger Web Security Academy topic list, followed by a cross-cutting attack-chain-composition step that runs outside the graph proper — each detection agent combining deterministic, re-executable HTTP-level probing with LLM-assisted triage and adversarial validation. The result is a report an experienced penetration tester would recognize as their own work: confirmed findings only, real evidence (request/response pairs, browser screenshots), plain-language and technical write-ups side by side, and a remediation path for every issue.</w:t>
+          <w:sz w:val="22"/>
+        </w:rPr>
+        <w:t xml:space="preserve">Verdikt is an AI-assisted, multi-agent DAST (Dynamic Application Security Testing) platform that performs manual-assessment-quality web, API, and LLM/chatbot penetration testing at automated speed. A single scan run executes a 35-node LangGraph DAG covering the OWASP Top 10 (2025), the OWASP Top 10 for LLM Applications (2026), the OWASP Agentic Security Initiative Top 10 (2026), and the full PortSwigger Web Security Academy topic list, followed by a cross-cutting attack-chain-composition step that runs outside the graph proper — each detection agent combining deterministic, re-executable HTTP-level probing with LLM-assisted triage and adversarial validation. The result is a report an experienced penetration tester would recognize as their own work: confirmed findings only, real evidence (request/response pairs, browser screenshots), plain-language and technical write-ups side by side, and a remediation path for every issue. One target type in that DAG — an analyst-configured </w:t>
+      </w:r>
+      <w:r>
+        <w:rPr>
+          <w:rFonts w:ascii="Consolas" w:hAnsi="Consolas"/>
+          <w:sz w:val="20"/>
+        </w:rPr>
+        <w:t>ChatbotTarget</w:t>
+      </w:r>
+      <w:r>
+        <w:rPr>
+          <w:sz w:val="22"/>
+        </w:rPr>
+        <w:t xml:space="preserve"> (§4/§7) — is conversational rather than crawlable, so the same scan run covers four fundamentally different surfaces in one pass: traditional multi-page web applications, JavaScript SPAs, JSON/REST APIs, and LLM-backed chatbots.</w:t>
       </w:r>
     </w:p>
     <w:p>
@@ -157,48 +154,22 @@
     <w:p>
       <w:r>
         <w:rPr>
-          <w:b/>
-          <w:color w:val="1C1E21"/>
-          <w:sz w:val="22"/>
-        </w:rPr>
-        <w:t>Current state, verified against the running codebase:</w:t>
-      </w:r>
-      <w:r>
-        <w:rPr>
-          <w:color w:val="1C1E21"/>
-          <w:sz w:val="22"/>
-        </w:rPr>
-        <w:t xml:space="preserve"> 52 files under </w:t>
+          <w:sz w:val="22"/>
+        </w:rPr>
+        <w:t xml:space="preserve">Current state, verified against the running codebase: 57 files under </w:t>
       </w:r>
       <w:r>
         <w:rPr>
           <w:rFonts w:ascii="Consolas" w:hAnsi="Consolas"/>
-          <w:color w:val="1C1E21"/>
           <w:sz w:val="20"/>
         </w:rPr>
         <w:t>app/agents/</w:t>
       </w:r>
       <w:r>
         <w:rPr>
-          <w:color w:val="1C1E21"/>
-          <w:sz w:val="22"/>
-        </w:rPr>
-        <w:t xml:space="preserve"> (31 of them graph nodes, the rest shared infrastructure and support modules), 30 API route modules, ~34 persisted data models, 10 external integrations, 18 YAML check catalogs (39 statically defined check IDs, plus a further dozen dynamically-generated ones), 36 Alembic migrations, 20 RBAC resources, and a backend test suite of </w:t>
-      </w:r>
-      <w:r>
-        <w:rPr>
-          <w:b/>
-          <w:color w:val="1C1E21"/>
-          <w:sz w:val="22"/>
-        </w:rPr>
-        <w:t>119 files / 667 collected tests</w:t>
-      </w:r>
-      <w:r>
-        <w:rPr>
-          <w:color w:val="1C1E21"/>
-          <w:sz w:val="22"/>
-        </w:rPr>
-        <w:t xml:space="preserve"> — all figures confirmed by direct inspection and by running the test collector, not estimated. Full reference tables for every one of these are in the appendices (§13–§24).</w:t>
+          <w:sz w:val="22"/>
+        </w:rPr>
+        <w:t xml:space="preserve"> (35 of them graph nodes, the rest shared infrastructure and support modules), 32 API route modules, 36 persisted data models, 10 external integrations, 22 YAML check catalogs (47 statically defined check IDs, plus a further dozen dynamically-generated ones), 39 Alembic migrations, 21 RBAC resources, and a backend test suite of 126 files / 721 collected tests — all figures confirmed by direct inspection and by running the test collector, not estimated. Full reference tables for every one of these are in the appendices (§13–§24).</w:t>
       </w:r>
     </w:p>
     <w:p>
@@ -323,16 +294,9 @@
       </w:pPr>
       <w:r>
         <w:rPr>
-          <w:b/>
-          <w:sz w:val="22"/>
-        </w:rPr>
-        <w:t>Multi-agent, not one big prompt.</w:t>
-      </w:r>
-      <w:r>
-        <w:rPr>
-          <w:sz w:val="22"/>
-        </w:rPr>
-        <w:t xml:space="preserve"> Thirty-one narrow, purpose-built detection agents each own one vulnerability class, run as parallel nodes in a LangGraph DAG, and use the cheapest technique that reliably confirms that class (a deterministic HTTP diff for SQL injection; a real headless-browser execution proof for XSS; a live out-of-band callback for SSRF). This keeps LLM usage focused on judgment calls — triage and adversarial validation — not busywork.</w:t>
+          <w:sz w:val="22"/>
+        </w:rPr>
+        <w:t>Multi-agent, not one big prompt. Thirty-five narrow, purpose-built detection agents each own one vulnerability class, run as parallel nodes in a LangGraph DAG, and use the cheapest technique that reliably confirms that class (a deterministic HTTP diff for SQL injection; a real headless-browser execution proof for XSS; a live out-of-band callback for SSRF). This keeps LLM usage focused on judgment calls — triage and adversarial validation — not busywork.</w:t>
       </w:r>
     </w:p>
     <w:p>
@@ -569,30 +533,19 @@
     <w:p>
       <w:r>
         <w:rPr>
-          <w:b/>
-          <w:color w:val="1C1E21"/>
-          <w:sz w:val="22"/>
-        </w:rPr>
-        <w:t>Backend:</w:t>
-      </w:r>
-      <w:r>
-        <w:rPr>
-          <w:color w:val="1C1E21"/>
-          <w:sz w:val="22"/>
-        </w:rPr>
-        <w:t xml:space="preserve"> Python, FastAPI, SQLAlchemy 2.0 (async), Alembic migrations (36 files, one linear chain), PostgreSQL. Dialect-agnostic ORM layer, so the test suite runs against ephemeral SQLite with zero external services (with one deliberately-accepted limitation: SQLite doesn't enforce </w:t>
+          <w:sz w:val="22"/>
+        </w:rPr>
+        <w:t xml:space="preserve">Backend: Python, FastAPI, SQLAlchemy 2.0 (async), Alembic migrations (39 files, one linear chain), PostgreSQL. Dialect-agnostic ORM layer, so the test suite runs against ephemeral SQLite with zero external services (with one deliberately-accepted limitation: SQLite doesn't enforce </w:t>
       </w:r>
       <w:r>
         <w:rPr>
           <w:rFonts w:ascii="Consolas" w:hAnsi="Consolas"/>
-          <w:color w:val="1C1E21"/>
           <w:sz w:val="20"/>
         </w:rPr>
         <w:t>ON DELETE CASCADE</w:t>
       </w:r>
       <w:r>
         <w:rPr>
-          <w:color w:val="1C1E21"/>
           <w:sz w:val="22"/>
         </w:rPr>
         <w:t>, so cascade behavior is verified live against the real Postgres, not by the unit suite).</w:t>
@@ -601,45 +554,32 @@
     <w:p>
       <w:r>
         <w:rPr>
-          <w:b/>
-          <w:color w:val="1C1E21"/>
-          <w:sz w:val="22"/>
-        </w:rPr>
-        <w:t>Frontend:</w:t>
-      </w:r>
-      <w:r>
-        <w:rPr>
-          <w:color w:val="1C1E21"/>
-          <w:sz w:val="22"/>
-        </w:rPr>
-        <w:t xml:space="preserve"> Vite + React + TypeScript, TanStack Query for server state, React Router, Tailwind CSS. A hand-written typed fetch client (</w:t>
+          <w:sz w:val="22"/>
+        </w:rPr>
+        <w:t>Frontend: Vite + React + TypeScript, TanStack Query for server state, React Router, Tailwind CSS. A hand-written typed fetch client (</w:t>
       </w:r>
       <w:r>
         <w:rPr>
           <w:rFonts w:ascii="Consolas" w:hAnsi="Consolas"/>
-          <w:color w:val="1C1E21"/>
           <w:sz w:val="20"/>
         </w:rPr>
         <w:t>src/api/client.ts</w:t>
       </w:r>
       <w:r>
         <w:rPr>
-          <w:color w:val="1C1E21"/>
-          <w:sz w:val="22"/>
-        </w:rPr>
-        <w:t xml:space="preserve">, 23 namespaced sub-objects, 62 exported types in </w:t>
+          <w:sz w:val="22"/>
+        </w:rPr>
+        <w:t xml:space="preserve">, 28 namespaced sub-objects, 67 exported types in </w:t>
       </w:r>
       <w:r>
         <w:rPr>
           <w:rFonts w:ascii="Consolas" w:hAnsi="Consolas"/>
-          <w:color w:val="1C1E21"/>
           <w:sz w:val="20"/>
         </w:rPr>
         <w:t>src/api/types.ts</w:t>
       </w:r>
       <w:r>
         <w:rPr>
-          <w:color w:val="1C1E21"/>
           <w:sz w:val="22"/>
         </w:rPr>
         <w:t>) mirrors the backend's Pydantic schemas.</w:t>
@@ -648,45 +588,58 @@
     <w:p>
       <w:r>
         <w:rPr>
-          <w:b/>
-          <w:color w:val="1C1E21"/>
-          <w:sz w:val="22"/>
-        </w:rPr>
-        <w:t>Agent orchestration:</w:t>
-      </w:r>
-      <w:r>
-        <w:rPr>
-          <w:color w:val="1C1E21"/>
-          <w:sz w:val="22"/>
-        </w:rPr>
-        <w:t xml:space="preserve"> LangGraph builds a 31-node directed graph per scan run, with genuine parallel fan-out where checks don't depend on each other (12 nodes off </w:t>
+          <w:sz w:val="22"/>
+        </w:rPr>
+        <w:t xml:space="preserve">Agent orchestration: LangGraph builds a 35-node directed graph per scan run, with genuine parallel fan-out where checks don't depend on each other (11 nodes off </w:t>
       </w:r>
       <w:r>
         <w:rPr>
           <w:rFonts w:ascii="Consolas" w:hAnsi="Consolas"/>
-          <w:color w:val="1C1E21"/>
           <w:sz w:val="20"/>
         </w:rPr>
         <w:t>recon</w:t>
       </w:r>
       <w:r>
         <w:rPr>
-          <w:color w:val="1C1E21"/>
-          <w:sz w:val="22"/>
-        </w:rPr>
-        <w:t xml:space="preserve">, 14 more off </w:t>
+          <w:sz w:val="22"/>
+        </w:rPr>
+        <w:t xml:space="preserve">, 19 more off </w:t>
       </w:r>
       <w:r>
         <w:rPr>
           <w:rFonts w:ascii="Consolas" w:hAnsi="Consolas"/>
-          <w:color w:val="1C1E21"/>
           <w:sz w:val="20"/>
         </w:rPr>
-        <w:t>authenticated_recon</w:t>
-      </w:r>
-      <w:r>
-        <w:rPr>
-          <w:color w:val="1C1E21"/>
+        <w:t>recon_planner</w:t>
+      </w:r>
+      <w:r>
+        <w:rPr>
+          <w:sz w:val="22"/>
+        </w:rPr>
+        <w:t xml:space="preserve">, one of which — </w:t>
+      </w:r>
+      <w:r>
+        <w:rPr>
+          <w:rFonts w:ascii="Consolas" w:hAnsi="Consolas"/>
+          <w:sz w:val="20"/>
+        </w:rPr>
+        <w:t>ai_business_logic_plan</w:t>
+      </w:r>
+      <w:r>
+        <w:rPr>
+          <w:sz w:val="22"/>
+        </w:rPr>
+        <w:t xml:space="preserve"> — itself fans out to </w:t>
+      </w:r>
+      <w:r>
+        <w:rPr>
+          <w:rFonts w:ascii="Consolas" w:hAnsi="Consolas"/>
+          <w:sz w:val="20"/>
+        </w:rPr>
+        <w:t>business_logic</w:t>
+      </w:r>
+      <w:r>
+        <w:rPr>
           <w:sz w:val="22"/>
         </w:rPr>
         <w:t xml:space="preserve">), and explicit sequencing where they do (every authenticated check waits on </w:t>
@@ -694,14 +647,12 @@
       <w:r>
         <w:rPr>
           <w:rFonts w:ascii="Consolas" w:hAnsi="Consolas"/>
-          <w:color w:val="1C1E21"/>
           <w:sz w:val="20"/>
         </w:rPr>
         <w:t>login</w:t>
       </w:r>
       <w:r>
         <w:rPr>
-          <w:color w:val="1C1E21"/>
           <w:sz w:val="22"/>
         </w:rPr>
         <w:t xml:space="preserve"> succeeding). </w:t>
@@ -709,44 +660,25 @@
       <w:r>
         <w:rPr>
           <w:rFonts w:ascii="Consolas" w:hAnsi="Consolas"/>
-          <w:color w:val="1C1E21"/>
           <w:sz w:val="20"/>
         </w:rPr>
         <w:t>chain_analysis</w:t>
       </w:r>
       <w:r>
         <w:rPr>
-          <w:color w:val="1C1E21"/>
-          <w:sz w:val="22"/>
-        </w:rPr>
-        <w:t xml:space="preserve"> is deliberately </w:t>
-      </w:r>
-      <w:r>
-        <w:rPr>
-          <w:i/>
-          <w:color w:val="1C1E21"/>
-          <w:sz w:val="22"/>
-        </w:rPr>
-        <w:t>not</w:t>
-      </w:r>
-      <w:r>
-        <w:rPr>
-          <w:color w:val="1C1E21"/>
-          <w:sz w:val="22"/>
-        </w:rPr>
-        <w:t xml:space="preserve"> a graph node — it runs as a separate step in </w:t>
+          <w:sz w:val="22"/>
+        </w:rPr>
+        <w:t xml:space="preserve"> is deliberately not a graph node — it runs as a separate step in </w:t>
       </w:r>
       <w:r>
         <w:rPr>
           <w:rFonts w:ascii="Consolas" w:hAnsi="Consolas"/>
-          <w:color w:val="1C1E21"/>
           <w:sz w:val="20"/>
         </w:rPr>
         <w:t>runner.py</w:t>
       </w:r>
       <w:r>
         <w:rPr>
-          <w:color w:val="1C1E21"/>
           <w:sz w:val="22"/>
         </w:rPr>
         <w:t xml:space="preserve"> after </w:t>
@@ -754,14 +686,12 @@
       <w:r>
         <w:rPr>
           <w:rFonts w:ascii="Consolas" w:hAnsi="Consolas"/>
-          <w:color w:val="1C1E21"/>
           <w:sz w:val="20"/>
         </w:rPr>
         <w:t>graph.ainvoke()</w:t>
       </w:r>
       <w:r>
         <w:rPr>
-          <w:color w:val="1C1E21"/>
           <w:sz w:val="22"/>
         </w:rPr>
         <w:t xml:space="preserve"> completes, since it needs the full, final set of findings from every other agent as its input.</w:t>
@@ -810,25 +740,9 @@
     <w:p>
       <w:r>
         <w:rPr>
-          <w:color w:val="1C1E21"/>
-          <w:sz w:val="22"/>
-        </w:rPr>
-        <w:t xml:space="preserve">Every engagement is modeled as a hierarchy that mirrors how a real pentest is scoped and re-run over time. This is a simplified view for readability — the full field-level reference for all ~34 models is in </w:t>
-      </w:r>
-      <w:r>
-        <w:rPr>
-          <w:b/>
-          <w:color w:val="1C1E21"/>
-          <w:sz w:val="22"/>
-        </w:rPr>
-        <w:t>Appendix §15</w:t>
-      </w:r>
-      <w:r>
-        <w:rPr>
-          <w:color w:val="1C1E21"/>
-          <w:sz w:val="22"/>
-        </w:rPr>
-        <w:t>.</w:t>
+          <w:sz w:val="22"/>
+        </w:rPr>
+        <w:t>Every engagement is modeled as a hierarchy that mirrors how a real pentest is scoped and re-run over time. This is a simplified view for readability — the full field-level reference for all 36 models is in Appendix §15.</w:t>
       </w:r>
     </w:p>
     <w:p>
@@ -838,7 +752,7 @@
       <w:r>
         <w:drawing>
           <wp:inline xmlns:a="http://schemas.openxmlformats.org/drawingml/2006/main" xmlns:pic="http://schemas.openxmlformats.org/drawingml/2006/picture">
-            <wp:extent cx="5760720" cy="3291840"/>
+            <wp:extent cx="5760720" cy="3005274"/>
             <wp:docPr id="2" name="Picture 2"/>
             <wp:cNvGraphicFramePr>
               <a:graphicFrameLocks noChangeAspect="1"/>
@@ -859,7 +773,7 @@
                   <pic:spPr>
                     <a:xfrm>
                       <a:off x="0" y="0"/>
-                      <a:ext cx="5760720" cy="3291840"/>
+                      <a:ext cx="5760720" cy="3005274"/>
                     </a:xfrm>
                     <a:prstGeom prst="rect"/>
                   </pic:spPr>
@@ -1458,6 +1372,237 @@
     </w:p>
     <w:p>
       <w:pPr>
+        <w:pStyle w:val="ListBullet"/>
+      </w:pPr>
+      <w:r>
+        <w:rPr>
+          <w:rFonts w:ascii="Consolas" w:hAnsi="Consolas"/>
+          <w:sz w:val="20"/>
+        </w:rPr>
+        <w:t>CredentialSet.extra_headers</w:t>
+      </w:r>
+      <w:r>
+        <w:rPr>
+          <w:sz w:val="22"/>
+        </w:rPr>
+        <w:t xml:space="preserve"> — static headers forced onto every request for that credential, the header-shaped equivalent of the pre-existing </w:t>
+      </w:r>
+      <w:r>
+        <w:rPr>
+          <w:rFonts w:ascii="Consolas" w:hAnsi="Consolas"/>
+          <w:sz w:val="20"/>
+        </w:rPr>
+        <w:t>extra_cookies</w:t>
+      </w:r>
+      <w:r>
+        <w:rPr>
+          <w:sz w:val="22"/>
+        </w:rPr>
+        <w:t xml:space="preserve"> (used e.g. to pin DVWA's </w:t>
+      </w:r>
+      <w:r>
+        <w:rPr>
+          <w:rFonts w:ascii="Consolas" w:hAnsi="Consolas"/>
+          <w:sz w:val="20"/>
+        </w:rPr>
+        <w:t>security</w:t>
+      </w:r>
+      <w:r>
+        <w:rPr>
+          <w:sz w:val="22"/>
+        </w:rPr>
+        <w:t xml:space="preserve"> difficulty cookie). Real, concrete motivation: an imported Postman/API collection often authenticates via a custom header (</w:t>
+      </w:r>
+      <w:r>
+        <w:rPr>
+          <w:rFonts w:ascii="Consolas" w:hAnsi="Consolas"/>
+          <w:sz w:val="20"/>
+        </w:rPr>
+        <w:t>X-API-Key</w:t>
+      </w:r>
+      <w:r>
+        <w:rPr>
+          <w:sz w:val="22"/>
+        </w:rPr>
+        <w:t xml:space="preserve"> and similar) rather than a bearer token, and </w:t>
+      </w:r>
+      <w:r>
+        <w:rPr>
+          <w:rFonts w:ascii="Consolas" w:hAnsi="Consolas"/>
+          <w:sz w:val="20"/>
+        </w:rPr>
+        <w:t>credential_type="api_token"</w:t>
+      </w:r>
+      <w:r>
+        <w:rPr>
+          <w:sz w:val="22"/>
+        </w:rPr>
+        <w:t xml:space="preserve"> could previously only ever produce a literal </w:t>
+      </w:r>
+      <w:r>
+        <w:rPr>
+          <w:rFonts w:ascii="Consolas" w:hAnsi="Consolas"/>
+          <w:sz w:val="20"/>
+        </w:rPr>
+        <w:t>Authorization: Bearer &lt;token&gt;</w:t>
+      </w:r>
+      <w:r>
+        <w:rPr>
+          <w:sz w:val="22"/>
+        </w:rPr>
+        <w:t xml:space="preserve"> header. </w:t>
+      </w:r>
+      <w:r>
+        <w:rPr>
+          <w:rFonts w:ascii="Consolas" w:hAnsi="Consolas"/>
+          <w:sz w:val="20"/>
+        </w:rPr>
+        <w:t>extra_headers</w:t>
+      </w:r>
+      <w:r>
+        <w:rPr>
+          <w:sz w:val="22"/>
+        </w:rPr>
+        <w:t xml:space="preserve"> applies on top of any credential type — </w:t>
+      </w:r>
+      <w:r>
+        <w:rPr>
+          <w:rFonts w:ascii="Consolas" w:hAnsi="Consolas"/>
+          <w:sz w:val="20"/>
+        </w:rPr>
+        <w:t>api_token</w:t>
+      </w:r>
+      <w:r>
+        <w:rPr>
+          <w:sz w:val="22"/>
+        </w:rPr>
+        <w:t>, form-login, or a recorded macro — so a custom header can also be layered onto a real login flow rather than only replacing it.</w:t>
+      </w:r>
+    </w:p>
+    <w:p>
+      <w:pPr>
+        <w:pStyle w:val="ListBullet"/>
+      </w:pPr>
+      <w:r>
+        <w:rPr>
+          <w:rFonts w:ascii="Consolas" w:hAnsi="Consolas"/>
+          <w:sz w:val="20"/>
+        </w:rPr>
+        <w:t>ChatbotTarget</w:t>
+      </w:r>
+      <w:r>
+        <w:rPr>
+          <w:sz w:val="22"/>
+        </w:rPr>
+        <w:t xml:space="preserve"> / </w:t>
+      </w:r>
+      <w:r>
+        <w:rPr>
+          <w:rFonts w:ascii="Consolas" w:hAnsi="Consolas"/>
+          <w:sz w:val="20"/>
+        </w:rPr>
+        <w:t>ChatbotAgencyProbe</w:t>
+      </w:r>
+      <w:r>
+        <w:rPr>
+          <w:sz w:val="22"/>
+        </w:rPr>
+        <w:t xml:space="preserve"> — analyst-configured conversational endpoints for the LLM/Chatbot Pentest capability (§7): </w:t>
+      </w:r>
+      <w:r>
+        <w:rPr>
+          <w:rFonts w:ascii="Consolas" w:hAnsi="Consolas"/>
+          <w:sz w:val="20"/>
+        </w:rPr>
+        <w:t>ChatbotTarget</w:t>
+      </w:r>
+      <w:r>
+        <w:rPr>
+          <w:sz w:val="22"/>
+        </w:rPr>
+        <w:t xml:space="preserve"> records how to talk to a chat API (</w:t>
+      </w:r>
+      <w:r>
+        <w:rPr>
+          <w:rFonts w:ascii="Consolas" w:hAnsi="Consolas"/>
+          <w:sz w:val="20"/>
+        </w:rPr>
+        <w:t>endpoint_url</w:t>
+      </w:r>
+      <w:r>
+        <w:rPr>
+          <w:sz w:val="22"/>
+        </w:rPr>
+        <w:t xml:space="preserve">, </w:t>
+      </w:r>
+      <w:r>
+        <w:rPr>
+          <w:rFonts w:ascii="Consolas" w:hAnsi="Consolas"/>
+          <w:sz w:val="20"/>
+        </w:rPr>
+        <w:t>http_method</w:t>
+      </w:r>
+      <w:r>
+        <w:rPr>
+          <w:sz w:val="22"/>
+        </w:rPr>
+        <w:t xml:space="preserve">, a </w:t>
+      </w:r>
+      <w:r>
+        <w:rPr>
+          <w:rFonts w:ascii="Consolas" w:hAnsi="Consolas"/>
+          <w:sz w:val="20"/>
+        </w:rPr>
+        <w:t>request_body_template</w:t>
+      </w:r>
+      <w:r>
+        <w:rPr>
+          <w:sz w:val="22"/>
+        </w:rPr>
+        <w:t xml:space="preserve"> with a literal </w:t>
+      </w:r>
+      <w:r>
+        <w:rPr>
+          <w:rFonts w:ascii="Consolas" w:hAnsi="Consolas"/>
+          <w:sz w:val="20"/>
+        </w:rPr>
+        <w:t>{message}</w:t>
+      </w:r>
+      <w:r>
+        <w:rPr>
+          <w:sz w:val="22"/>
+        </w:rPr>
+        <w:t xml:space="preserve"> placeholder, and where to read the reply text out of the JSON response), optionally with one or more </w:t>
+      </w:r>
+      <w:r>
+        <w:rPr>
+          <w:rFonts w:ascii="Consolas" w:hAnsi="Consolas"/>
+          <w:sz w:val="20"/>
+        </w:rPr>
+        <w:t>ChatbotAgencyProbe</w:t>
+      </w:r>
+      <w:r>
+        <w:rPr>
+          <w:sz w:val="22"/>
+        </w:rPr>
+        <w:t xml:space="preserve"> rows — one per analyst-declared forbidden action (e.g. "Process a refund without a valid order ID"), the same "row per testable thing, FK to its parent, created_by for audit" shape </w:t>
+      </w:r>
+      <w:r>
+        <w:rPr>
+          <w:rFonts w:ascii="Consolas" w:hAnsi="Consolas"/>
+          <w:sz w:val="20"/>
+        </w:rPr>
+        <w:t>BusinessRule</w:t>
+      </w:r>
+      <w:r>
+        <w:rPr>
+          <w:sz w:val="22"/>
+        </w:rPr>
+        <w:t xml:space="preserve"> itself uses.</w:t>
+      </w:r>
+    </w:p>
+    <w:p>
+      <w:pPr>
         <w:pStyle w:val="Heading2"/>
       </w:pPr>
       <w:r>
@@ -1469,7 +1614,10 @@
         <w:pStyle w:val="Heading3"/>
       </w:pPr>
       <w:r>
-        <w:t>5.1 Scan lifecycle — the real, verified 31-node DAG</w:t>
+        <w:rPr>
+          <w:sz w:val="22"/>
+        </w:rPr>
+        <w:t>5.1 Scan lifecycle — the real, verified 35-node DAG</w:t>
       </w:r>
     </w:p>
     <w:p>
@@ -1479,7 +1627,7 @@
       <w:r>
         <w:drawing>
           <wp:inline xmlns:a="http://schemas.openxmlformats.org/drawingml/2006/main" xmlns:pic="http://schemas.openxmlformats.org/drawingml/2006/picture">
-            <wp:extent cx="5760720" cy="5305153"/>
+            <wp:extent cx="5760720" cy="5981156"/>
             <wp:docPr id="3" name="Picture 3"/>
             <wp:cNvGraphicFramePr>
               <a:graphicFrameLocks noChangeAspect="1"/>
@@ -1500,7 +1648,7 @@
                   <pic:spPr>
                     <a:xfrm>
                       <a:off x="0" y="0"/>
-                      <a:ext cx="5760720" cy="5305153"/>
+                      <a:ext cx="5760720" cy="5981156"/>
                     </a:xfrm>
                     <a:prstGeom prst="rect"/>
                   </pic:spPr>
@@ -1515,37 +1663,19 @@
     <w:p>
       <w:r>
         <w:rPr>
-          <w:color w:val="1C1E21"/>
-          <w:sz w:val="22"/>
-        </w:rPr>
-        <w:t xml:space="preserve">There are genuinely </w:t>
-      </w:r>
-      <w:r>
-        <w:rPr>
-          <w:b/>
-          <w:color w:val="1C1E21"/>
-          <w:sz w:val="22"/>
-        </w:rPr>
-        <w:t>no conditional edges anywhere in this graph</w:t>
-      </w:r>
-      <w:r>
-        <w:rPr>
-          <w:color w:val="1C1E21"/>
-          <w:sz w:val="22"/>
-        </w:rPr>
-        <w:t xml:space="preserve"> — </w:t>
+          <w:sz w:val="22"/>
+        </w:rPr>
+        <w:t xml:space="preserve">There are genuinely no conditional edges anywhere in this graph — </w:t>
       </w:r>
       <w:r>
         <w:rPr>
           <w:rFonts w:ascii="Consolas" w:hAnsi="Consolas"/>
-          <w:color w:val="1C1E21"/>
           <w:sz w:val="20"/>
         </w:rPr>
         <w:t>add_conditional_edges</w:t>
       </w:r>
       <w:r>
         <w:rPr>
-          <w:color w:val="1C1E21"/>
           <w:sz w:val="22"/>
         </w:rPr>
         <w:t xml:space="preserve"> is never called. Every node listed always runs. Recon deliberately runs twice: once unauthenticated (all a purely anonymous visitor would ever see — usually just a login form), and once fully authenticated after </w:t>
@@ -1553,14 +1683,12 @@
       <w:r>
         <w:rPr>
           <w:rFonts w:ascii="Consolas" w:hAnsi="Consolas"/>
-          <w:color w:val="1C1E21"/>
           <w:sz w:val="20"/>
         </w:rPr>
         <w:t>login</w:t>
       </w:r>
       <w:r>
         <w:rPr>
-          <w:color w:val="1C1E21"/>
           <w:sz w:val="22"/>
         </w:rPr>
         <w:t xml:space="preserve"> succeeds. This was a real, live-found gap during development — a pre-login-only crawl against DVWA discovered exactly one form (the login form itself), leaving every other agent with nothing to test. </w:t>
@@ -1568,44 +1696,64 @@
       <w:r>
         <w:rPr>
           <w:rFonts w:ascii="Consolas" w:hAnsi="Consolas"/>
-          <w:color w:val="1C1E21"/>
           <w:sz w:val="20"/>
         </w:rPr>
+        <w:t>clickjacking</w:t>
+      </w:r>
+      <w:r>
+        <w:rPr>
+          <w:sz w:val="22"/>
+        </w:rPr>
+        <w:t xml:space="preserve"> fans out from </w:t>
+      </w:r>
+      <w:r>
+        <w:rPr>
+          <w:rFonts w:ascii="Consolas" w:hAnsi="Consolas"/>
+          <w:sz w:val="20"/>
+        </w:rPr>
         <w:t>recon_planner</w:t>
       </w:r>
       <w:r>
         <w:rPr>
-          <w:color w:val="1C1E21"/>
-          <w:sz w:val="22"/>
-        </w:rPr>
-        <w:t xml:space="preserve"> and </w:t>
+          <w:sz w:val="22"/>
+        </w:rPr>
+        <w:t xml:space="preserve">, not </w:t>
       </w:r>
       <w:r>
         <w:rPr>
           <w:rFonts w:ascii="Consolas" w:hAnsi="Consolas"/>
-          <w:color w:val="1C1E21"/>
           <w:sz w:val="20"/>
         </w:rPr>
-        <w:t>ai_business_logic_plan</w:t>
-      </w:r>
-      <w:r>
-        <w:rPr>
-          <w:color w:val="1C1E21"/>
-          <w:sz w:val="22"/>
-        </w:rPr>
-        <w:t xml:space="preserve"> are later additions to the original 24-node graph, both following the same propose-then-verify discipline as everything else in §5.3 — an AI suggestion is worth nothing here until something deterministic confirms it. The newest four nodes — </w:t>
+        <w:t>recon</w:t>
+      </w:r>
+      <w:r>
+        <w:rPr>
+          <w:sz w:val="22"/>
+        </w:rPr>
+        <w:t xml:space="preserve"> — it needs both the authenticated crawl's real endpoint list and a populated </w:t>
       </w:r>
       <w:r>
         <w:rPr>
           <w:rFonts w:ascii="Consolas" w:hAnsi="Consolas"/>
-          <w:color w:val="1C1E21"/>
           <w:sz w:val="20"/>
         </w:rPr>
+        <w:t>sessions</w:t>
+      </w:r>
+      <w:r>
+        <w:rPr>
+          <w:sz w:val="22"/>
+        </w:rPr>
+        <w:t xml:space="preserve"> dict. Four nodes — </w:t>
+      </w:r>
+      <w:r>
+        <w:rPr>
+          <w:rFonts w:ascii="Consolas" w:hAnsi="Consolas"/>
+          <w:sz w:val="20"/>
+        </w:rPr>
         <w:t>weak_password_policy</w:t>
       </w:r>
       <w:r>
         <w:rPr>
-          <w:color w:val="1C1E21"/>
           <w:sz w:val="22"/>
         </w:rPr>
         <w:t xml:space="preserve">, </w:t>
@@ -1613,14 +1761,12 @@
       <w:r>
         <w:rPr>
           <w:rFonts w:ascii="Consolas" w:hAnsi="Consolas"/>
-          <w:color w:val="1C1E21"/>
           <w:sz w:val="20"/>
         </w:rPr>
         <w:t>csv_injection</w:t>
       </w:r>
       <w:r>
         <w:rPr>
-          <w:color w:val="1C1E21"/>
           <w:sz w:val="22"/>
         </w:rPr>
         <w:t xml:space="preserve">, </w:t>
@@ -1628,14 +1774,12 @@
       <w:r>
         <w:rPr>
           <w:rFonts w:ascii="Consolas" w:hAnsi="Consolas"/>
-          <w:color w:val="1C1E21"/>
           <w:sz w:val="20"/>
         </w:rPr>
         <w:t>session_invalidation</w:t>
       </w:r>
       <w:r>
         <w:rPr>
-          <w:color w:val="1C1E21"/>
           <w:sz w:val="22"/>
         </w:rPr>
         <w:t xml:space="preserve">, </w:t>
@@ -1643,29 +1787,90 @@
       <w:r>
         <w:rPr>
           <w:rFonts w:ascii="Consolas" w:hAnsi="Consolas"/>
-          <w:color w:val="1C1E21"/>
           <w:sz w:val="20"/>
         </w:rPr>
         <w:t>vulnerable_components</w:t>
       </w:r>
       <w:r>
         <w:rPr>
-          <w:color w:val="1C1E21"/>
-          <w:sz w:val="22"/>
-        </w:rPr>
-        <w:t xml:space="preserve"> — were ported from a sibling DAST project and mapped onto this same architecture (deterministic detector → LLM triage → deterministic re-execution → adversarial validation, no LLM-only confirmation for any of them); see §7 for what each one actually checks. </w:t>
+          <w:sz w:val="22"/>
+        </w:rPr>
+        <w:t xml:space="preserve"> — were ported from a sibling DAST project (deterministic detector → LLM triage → deterministic re-execution → adversarial validation, no LLM-only confirmation for any of them); three more — </w:t>
       </w:r>
       <w:r>
         <w:rPr>
           <w:rFonts w:ascii="Consolas" w:hAnsi="Consolas"/>
-          <w:color w:val="1C1E21"/>
           <w:sz w:val="20"/>
         </w:rPr>
+        <w:t>csp_bypass</w:t>
+      </w:r>
+      <w:r>
+        <w:rPr>
+          <w:sz w:val="22"/>
+        </w:rPr>
+        <w:t xml:space="preserve">, </w:t>
+      </w:r>
+      <w:r>
+        <w:rPr>
+          <w:rFonts w:ascii="Consolas" w:hAnsi="Consolas"/>
+          <w:sz w:val="20"/>
+        </w:rPr>
+        <w:t>api_version</w:t>
+      </w:r>
+      <w:r>
+        <w:rPr>
+          <w:sz w:val="22"/>
+        </w:rPr>
+        <w:t xml:space="preserve">, </w:t>
+      </w:r>
+      <w:r>
+        <w:rPr>
+          <w:rFonts w:ascii="Consolas" w:hAnsi="Consolas"/>
+          <w:sz w:val="20"/>
+        </w:rPr>
+        <w:t>open_redirect</w:t>
+      </w:r>
+      <w:r>
+        <w:rPr>
+          <w:sz w:val="22"/>
+        </w:rPr>
+        <w:t xml:space="preserve"> — are single-check nodes following that same discipline. The newest node, </w:t>
+      </w:r>
+      <w:r>
+        <w:rPr>
+          <w:rFonts w:ascii="Consolas" w:hAnsi="Consolas"/>
+          <w:sz w:val="20"/>
+        </w:rPr>
+        <w:t>chatbot_injection</w:t>
+      </w:r>
+      <w:r>
+        <w:rPr>
+          <w:sz w:val="22"/>
+        </w:rPr>
+        <w:t xml:space="preserve">, is the sole node for the entire Chatbot/LLM Pentest capability (§7) — all 5 of its checks live as methods on one </w:t>
+      </w:r>
+      <w:r>
+        <w:rPr>
+          <w:rFonts w:ascii="Consolas" w:hAnsi="Consolas"/>
+          <w:sz w:val="20"/>
+        </w:rPr>
+        <w:t>ChatbotInjectionAgent.run()</w:t>
+      </w:r>
+      <w:r>
+        <w:rPr>
+          <w:sz w:val="22"/>
+        </w:rPr>
+        <w:t xml:space="preserve"> rather than one node per check. See §7 for what each one actually checks. </w:t>
+      </w:r>
+      <w:r>
+        <w:rPr>
+          <w:rFonts w:ascii="Consolas" w:hAnsi="Consolas"/>
+          <w:sz w:val="20"/>
+        </w:rPr>
         <w:t>chain_analysis</w:t>
       </w:r>
       <w:r>
         <w:rPr>
-          <w:color w:val="1C1E21"/>
           <w:sz w:val="22"/>
         </w:rPr>
         <w:t xml:space="preserve"> runs outside the graph proper (not a </w:t>
@@ -1673,14 +1878,12 @@
       <w:r>
         <w:rPr>
           <w:rFonts w:ascii="Consolas" w:hAnsi="Consolas"/>
-          <w:color w:val="1C1E21"/>
           <w:sz w:val="20"/>
         </w:rPr>
         <w:t>graph.add_node</w:t>
       </w:r>
       <w:r>
         <w:rPr>
-          <w:color w:val="1C1E21"/>
           <w:sz w:val="22"/>
         </w:rPr>
         <w:t xml:space="preserve"> call, called directly by </w:t>
@@ -1688,14 +1891,12 @@
       <w:r>
         <w:rPr>
           <w:rFonts w:ascii="Consolas" w:hAnsi="Consolas"/>
-          <w:color w:val="1C1E21"/>
           <w:sz w:val="20"/>
         </w:rPr>
         <w:t>runner.py</w:t>
       </w:r>
       <w:r>
         <w:rPr>
-          <w:color w:val="1C1E21"/>
           <w:sz w:val="22"/>
         </w:rPr>
         <w:t xml:space="preserve"> after </w:t>
@@ -1703,17 +1904,15 @@
       <w:r>
         <w:rPr>
           <w:rFonts w:ascii="Consolas" w:hAnsi="Consolas"/>
-          <w:color w:val="1C1E21"/>
           <w:sz w:val="20"/>
         </w:rPr>
         <w:t>graph.ainvoke()</w:t>
       </w:r>
       <w:r>
         <w:rPr>
-          <w:color w:val="1C1E21"/>
-          <w:sz w:val="22"/>
-        </w:rPr>
-        <w:t xml:space="preserve"> returns), so it's not counted in the 31.</w:t>
+          <w:sz w:val="22"/>
+        </w:rPr>
+        <w:t xml:space="preserve"> returns), so it's not counted in the 35.</w:t>
       </w:r>
     </w:p>
     <w:p>
@@ -2003,7 +2202,23 @@
         <w:pStyle w:val="Heading3"/>
       </w:pPr>
       <w:r>
-        <w:t>5.2 What's in `app/agents/` beyond the 31 graph nodes</w:t>
+        <w:rPr>
+          <w:sz w:val="22"/>
+        </w:rPr>
+        <w:t xml:space="preserve">5.2 What's in </w:t>
+      </w:r>
+      <w:r>
+        <w:rPr>
+          <w:rFonts w:ascii="Consolas" w:hAnsi="Consolas"/>
+          <w:sz w:val="20"/>
+        </w:rPr>
+        <w:t>app/agents/</w:t>
+      </w:r>
+      <w:r>
+        <w:rPr>
+          <w:sz w:val="22"/>
+        </w:rPr>
+        <w:t xml:space="preserve"> beyond the 35 graph nodes</w:t>
       </w:r>
     </w:p>
     <w:p>
@@ -2268,19 +2483,19 @@
             <w:tcW w:type="dxa" w:w="4320"/>
           </w:tcPr>
           <w:p>
-            <w:r>
-              <w:rPr>
-                <w:rFonts w:ascii="Consolas" w:hAnsi="Consolas"/>
-                <w:color w:val="8A2BE2"/>
-                <w:sz w:val="16"/>
+            <w:r/>
+            <w:r>
+              <w:rPr>
+                <w:rFonts w:ascii="Consolas" w:hAnsi="Consolas"/>
+                <w:sz w:val="20"/>
               </w:rPr>
               <w:t>build_graph()</w:t>
             </w:r>
             <w:r>
               <w:rPr>
-                <w:sz w:val="18"/>
-              </w:rPr>
-              <w:t xml:space="preserve"> — wires the 31-node LangGraph DAG itself; the only file that knows the full node/edge topology</w:t>
+                <w:sz w:val="22"/>
+              </w:rPr>
+              <w:t xml:space="preserve"> — wires the 35-node LangGraph DAG itself; the only file that knows the full node/edge topology</w:t>
             </w:r>
           </w:p>
         </w:tc>
@@ -4818,37 +5033,19 @@
     <w:p>
       <w:r>
         <w:rPr>
-          <w:color w:val="1C1E21"/>
-          <w:sz w:val="22"/>
-        </w:rPr>
-        <w:t xml:space="preserve">Coverage maps to the OWASP Top 10 (2025) and the PortSwigger Web Security Academy topic list. The full, exact list of every check ID, its severity, and its CWE is in </w:t>
-      </w:r>
-      <w:r>
-        <w:rPr>
-          <w:b/>
-          <w:color w:val="1C1E21"/>
-          <w:sz w:val="22"/>
-        </w:rPr>
-        <w:t>Appendix §17</w:t>
-      </w:r>
-      <w:r>
-        <w:rPr>
-          <w:color w:val="1C1E21"/>
-          <w:sz w:val="22"/>
-        </w:rPr>
-        <w:t xml:space="preserve"> (39 YAML-defined checks across 18 catalog files, plus a further ~13 dynamically-generated check IDs emitted directly by agent code for parameterized findings like </w:t>
+          <w:sz w:val="22"/>
+        </w:rPr>
+        <w:t xml:space="preserve">Coverage maps to the OWASP Top 10 (2025), the OWASP Top 10 for LLM Applications (2026), the OWASP Agentic Security Initiative Top 10 (2026), and the PortSwigger Web Security Academy topic list. The full, exact list of every check ID, its severity, and its CWE is in Appendix §17 (47 YAML-defined checks across 22 catalog files, plus a further ~13 dynamically-generated check IDs emitted directly by agent code for parameterized findings like </w:t>
       </w:r>
       <w:r>
         <w:rPr>
           <w:rFonts w:ascii="Consolas" w:hAnsi="Consolas"/>
-          <w:color w:val="1C1E21"/>
           <w:sz w:val="20"/>
         </w:rPr>
         <w:t>sqli-error</w:t>
       </w:r>
       <w:r>
         <w:rPr>
-          <w:color w:val="1C1E21"/>
           <w:sz w:val="22"/>
         </w:rPr>
         <w:t xml:space="preserve"> / </w:t>
@@ -4856,14 +5053,12 @@
       <w:r>
         <w:rPr>
           <w:rFonts w:ascii="Consolas" w:hAnsi="Consolas"/>
-          <w:color w:val="1C1E21"/>
           <w:sz w:val="20"/>
         </w:rPr>
         <w:t>access-control-{comparison_type}</w:t>
       </w:r>
       <w:r>
         <w:rPr>
-          <w:color w:val="1C1E21"/>
           <w:sz w:val="22"/>
         </w:rPr>
         <w:t>). By category:</w:t>
@@ -5215,10 +5410,13 @@
     </w:p>
     <w:p>
       <w:pPr>
-        <w:pStyle w:val="Heading2"/>
+        <w:pStyle w:val="ListBullet"/>
       </w:pPr>
       <w:r>
-        <w:t>8. Retest, Rescan &amp; Attack Chain Analysis</w:t>
+        <w:rPr>
+          <w:sz w:val="22"/>
+        </w:rPr>
+        <w:t>API-specific — deprecated API version excessive data exposure (an older, still-live version of an endpoint returning fields a current version has since restricted), open redirect</w:t>
       </w:r>
     </w:p>
     <w:p>
@@ -5227,86 +5425,9 @@
       </w:pPr>
       <w:r>
         <w:rPr>
-          <w:b/>
-          <w:sz w:val="22"/>
-        </w:rPr>
-        <w:t>Rescan</w:t>
-      </w:r>
-      <w:r>
-        <w:rPr>
-          <w:sz w:val="22"/>
-        </w:rPr>
-        <w:t xml:space="preserve"> (</w:t>
-      </w:r>
-      <w:r>
-        <w:rPr>
-          <w:rFonts w:ascii="Consolas" w:hAnsi="Consolas"/>
-          <w:color w:val="8A2BE2"/>
-          <w:sz w:val="20"/>
-        </w:rPr>
-        <w:t>retest.py</w:t>
-      </w:r>
-      <w:r>
-        <w:rPr>
-          <w:sz w:val="22"/>
-        </w:rPr>
-        <w:t xml:space="preserve">) — a full re-run of every agent against the current state of the target, diffed against the prior run: new findings, </w:t>
-      </w:r>
-      <w:r>
-        <w:rPr>
-          <w:rFonts w:ascii="Consolas" w:hAnsi="Consolas"/>
-          <w:color w:val="8A2BE2"/>
-          <w:sz w:val="20"/>
-        </w:rPr>
-        <w:t>still_open</w:t>
-      </w:r>
-      <w:r>
-        <w:rPr>
-          <w:sz w:val="22"/>
-        </w:rPr>
-        <w:t xml:space="preserve">, and </w:t>
-      </w:r>
-      <w:r>
-        <w:rPr>
-          <w:rFonts w:ascii="Consolas" w:hAnsi="Consolas"/>
-          <w:color w:val="8A2BE2"/>
-          <w:sz w:val="20"/>
-        </w:rPr>
-        <w:t>fixed</w:t>
-      </w:r>
-      <w:r>
-        <w:rPr>
-          <w:sz w:val="22"/>
-        </w:rPr>
-        <w:t xml:space="preserve">. A human's prior </w:t>
-      </w:r>
-      <w:r>
-        <w:rPr>
-          <w:rFonts w:ascii="Consolas" w:hAnsi="Consolas"/>
-          <w:color w:val="8A2BE2"/>
-          <w:sz w:val="20"/>
-        </w:rPr>
-        <w:t>risk_accepted</w:t>
-      </w:r>
-      <w:r>
-        <w:rPr>
-          <w:sz w:val="22"/>
-        </w:rPr>
-        <w:t xml:space="preserve">/ </w:t>
-      </w:r>
-      <w:r>
-        <w:rPr>
-          <w:rFonts w:ascii="Consolas" w:hAnsi="Consolas"/>
-          <w:color w:val="8A2BE2"/>
-          <w:sz w:val="20"/>
-        </w:rPr>
-        <w:t>false_positive_after_review</w:t>
-      </w:r>
-      <w:r>
-        <w:rPr>
-          <w:sz w:val="22"/>
-        </w:rPr>
-        <w:t xml:space="preserve"> decision is never silently overridden.</w:t>
+          <w:sz w:val="22"/>
+        </w:rPr>
+        <w:t>CSP bypass — a JSONP callback endpoint reachable under an allow-listed script-src host, defeating an otherwise-correct CSP</w:t>
       </w:r>
     </w:p>
     <w:p>
@@ -5315,44 +5436,134 @@
       </w:pPr>
       <w:r>
         <w:rPr>
-          <w:b/>
-          <w:sz w:val="22"/>
-        </w:rPr>
-        <w:t>Retest</w:t>
-      </w:r>
-      <w:r>
-        <w:rPr>
-          <w:sz w:val="22"/>
-        </w:rPr>
-        <w:t xml:space="preserve"> (</w:t>
+          <w:sz w:val="22"/>
+        </w:rPr>
+        <w:t xml:space="preserve">LLM / Chatbot Pentest — a wholly new capability, covering a conversational endpoint the crawler can't discover on its own (an analyst-configured </w:t>
       </w:r>
       <w:r>
         <w:rPr>
           <w:rFonts w:ascii="Consolas" w:hAnsi="Consolas"/>
-          <w:color w:val="8A2BE2"/>
           <w:sz w:val="20"/>
         </w:rPr>
-        <w:t>retest_registry.py</w:t>
-      </w:r>
-      <w:r>
-        <w:rPr>
-          <w:sz w:val="22"/>
-        </w:rPr>
-        <w:t xml:space="preserve">, </w:t>
+        <w:t>ChatbotTarget</w:t>
+      </w:r>
+      <w:r>
+        <w:rPr>
+          <w:sz w:val="22"/>
+        </w:rPr>
+        <w:t>, §4), checked by one agent (</w:t>
       </w:r>
       <w:r>
         <w:rPr>
           <w:rFonts w:ascii="Consolas" w:hAnsi="Consolas"/>
-          <w:color w:val="8A2BE2"/>
           <w:sz w:val="20"/>
         </w:rPr>
-        <w:t>POST /findings/{id}/retest</w:t>
-      </w:r>
-      <w:r>
-        <w:rPr>
-          <w:sz w:val="22"/>
-        </w:rPr>
-        <w:t>) — a targeted, single-finding re-verification that deliberately reuses each check's own original detection logic (including its "private" helper functions) so a retest can never drift from the exact logic that earned the finding its original confirmation.</w:t>
+        <w:t>ChatbotInjectionAgent</w:t>
+      </w:r>
+      <w:r>
+        <w:rPr>
+          <w:sz w:val="22"/>
+        </w:rPr>
+        <w:t>) against the OWASP LLM Top 10 2026 and Agentic Top 10 2026: LLM01 Prompt Injection (</w:t>
+      </w:r>
+      <w:r>
+        <w:rPr>
+          <w:rFonts w:ascii="Consolas" w:hAnsi="Consolas"/>
+          <w:sz w:val="20"/>
+        </w:rPr>
+        <w:t>chatbot-prompt-injection-direct</w:t>
+      </w:r>
+      <w:r>
+        <w:rPr>
+          <w:sz w:val="22"/>
+        </w:rPr>
+        <w:t>, deterministic marker-echo), LLM08 Hidden Context Exposure (</w:t>
+      </w:r>
+      <w:r>
+        <w:rPr>
+          <w:rFonts w:ascii="Consolas" w:hAnsi="Consolas"/>
+          <w:sz w:val="20"/>
+        </w:rPr>
+        <w:t>chatbot-system-prompt-extraction</w:t>
+      </w:r>
+      <w:r>
+        <w:rPr>
+          <w:sz w:val="22"/>
+        </w:rPr>
+        <w:t xml:space="preserve">, AI-triage + adversarial validation, the same two-pass pipeline </w:t>
+      </w:r>
+      <w:r>
+        <w:rPr>
+          <w:rFonts w:ascii="Consolas" w:hAnsi="Consolas"/>
+          <w:sz w:val="20"/>
+        </w:rPr>
+        <w:t>access_control.py</w:t>
+      </w:r>
+      <w:r>
+        <w:rPr>
+          <w:sz w:val="22"/>
+        </w:rPr>
+        <w:t xml:space="preserve"> uses), LLM10 Improper Output Handling (</w:t>
+      </w:r>
+      <w:r>
+        <w:rPr>
+          <w:rFonts w:ascii="Consolas" w:hAnsi="Consolas"/>
+          <w:sz w:val="20"/>
+        </w:rPr>
+        <w:t>chatbot-improper-output-handling</w:t>
+      </w:r>
+      <w:r>
+        <w:rPr>
+          <w:sz w:val="22"/>
+        </w:rPr>
+        <w:t>, deterministic unescaped-marker reflection — the JSON-API equivalent of reflected XSS), LLM03 Excessive Agency (</w:t>
+      </w:r>
+      <w:r>
+        <w:rPr>
+          <w:rFonts w:ascii="Consolas" w:hAnsi="Consolas"/>
+          <w:sz w:val="20"/>
+        </w:rPr>
+        <w:t>chatbot-excessive-agency</w:t>
+      </w:r>
+      <w:r>
+        <w:rPr>
+          <w:sz w:val="22"/>
+        </w:rPr>
+        <w:t xml:space="preserve">, AI-judged against analyst-declared </w:t>
+      </w:r>
+      <w:r>
+        <w:rPr>
+          <w:rFonts w:ascii="Consolas" w:hAnsi="Consolas"/>
+          <w:sz w:val="20"/>
+        </w:rPr>
+        <w:t>ChatbotAgencyProbe</w:t>
+      </w:r>
+      <w:r>
+        <w:rPr>
+          <w:sz w:val="22"/>
+        </w:rPr>
+        <w:t xml:space="preserve"> rows), and ASI05 Unexpected Code Execution (</w:t>
+      </w:r>
+      <w:r>
+        <w:rPr>
+          <w:rFonts w:ascii="Consolas" w:hAnsi="Consolas"/>
+          <w:sz w:val="20"/>
+        </w:rPr>
+        <w:t>chatbot-unexpected-code-execution</w:t>
+      </w:r>
+      <w:r>
+        <w:rPr>
+          <w:sz w:val="22"/>
+        </w:rPr>
+        <w:t>, AI-judged: asks the bot to run attacker-supplied code and checks whether the reply claims to have executed it — Verdikt never executes anything itself). Deliberately deferred, with reasons on record: ASI02 Tool Misuse (the "unauthorized purpose" half is already LLM03 under a different name; the "malicious arguments to a real tool call" half needs tool/function-manifest introspection Verdikt doesn't have yet) and indirect injection via RAG-corpus poisoning (no safe, generic way to plant content into an arbitrary target's retrieval corpus).</w:t>
+      </w:r>
+    </w:p>
+    <w:p>
+      <w:pPr>
+        <w:pStyle w:val="Heading2"/>
+      </w:pPr>
+      <w:r>
+        <w:t>8. Retest, Rescan &amp; Attack Chain Analysis</w:t>
       </w:r>
     </w:p>
     <w:p>
@@ -5364,6 +5575,140 @@
           <w:b/>
           <w:sz w:val="22"/>
         </w:rPr>
+        <w:t>Rescan</w:t>
+      </w:r>
+      <w:r>
+        <w:rPr>
+          <w:sz w:val="22"/>
+        </w:rPr>
+        <w:t xml:space="preserve"> (</w:t>
+      </w:r>
+      <w:r>
+        <w:rPr>
+          <w:rFonts w:ascii="Consolas" w:hAnsi="Consolas"/>
+          <w:color w:val="8A2BE2"/>
+          <w:sz w:val="20"/>
+        </w:rPr>
+        <w:t>retest.py</w:t>
+      </w:r>
+      <w:r>
+        <w:rPr>
+          <w:sz w:val="22"/>
+        </w:rPr>
+        <w:t xml:space="preserve">) — a full re-run of every agent against the current state of the target, diffed against the prior run: new findings, </w:t>
+      </w:r>
+      <w:r>
+        <w:rPr>
+          <w:rFonts w:ascii="Consolas" w:hAnsi="Consolas"/>
+          <w:color w:val="8A2BE2"/>
+          <w:sz w:val="20"/>
+        </w:rPr>
+        <w:t>still_open</w:t>
+      </w:r>
+      <w:r>
+        <w:rPr>
+          <w:sz w:val="22"/>
+        </w:rPr>
+        <w:t xml:space="preserve">, and </w:t>
+      </w:r>
+      <w:r>
+        <w:rPr>
+          <w:rFonts w:ascii="Consolas" w:hAnsi="Consolas"/>
+          <w:color w:val="8A2BE2"/>
+          <w:sz w:val="20"/>
+        </w:rPr>
+        <w:t>fixed</w:t>
+      </w:r>
+      <w:r>
+        <w:rPr>
+          <w:sz w:val="22"/>
+        </w:rPr>
+        <w:t xml:space="preserve">. A human's prior </w:t>
+      </w:r>
+      <w:r>
+        <w:rPr>
+          <w:rFonts w:ascii="Consolas" w:hAnsi="Consolas"/>
+          <w:color w:val="8A2BE2"/>
+          <w:sz w:val="20"/>
+        </w:rPr>
+        <w:t>risk_accepted</w:t>
+      </w:r>
+      <w:r>
+        <w:rPr>
+          <w:sz w:val="22"/>
+        </w:rPr>
+        <w:t xml:space="preserve">/ </w:t>
+      </w:r>
+      <w:r>
+        <w:rPr>
+          <w:rFonts w:ascii="Consolas" w:hAnsi="Consolas"/>
+          <w:color w:val="8A2BE2"/>
+          <w:sz w:val="20"/>
+        </w:rPr>
+        <w:t>false_positive_after_review</w:t>
+      </w:r>
+      <w:r>
+        <w:rPr>
+          <w:sz w:val="22"/>
+        </w:rPr>
+        <w:t xml:space="preserve"> decision is never silently overridden.</w:t>
+      </w:r>
+    </w:p>
+    <w:p>
+      <w:pPr>
+        <w:pStyle w:val="ListBullet"/>
+      </w:pPr>
+      <w:r>
+        <w:rPr>
+          <w:b/>
+          <w:sz w:val="22"/>
+        </w:rPr>
+        <w:t>Retest</w:t>
+      </w:r>
+      <w:r>
+        <w:rPr>
+          <w:sz w:val="22"/>
+        </w:rPr>
+        <w:t xml:space="preserve"> (</w:t>
+      </w:r>
+      <w:r>
+        <w:rPr>
+          <w:rFonts w:ascii="Consolas" w:hAnsi="Consolas"/>
+          <w:color w:val="8A2BE2"/>
+          <w:sz w:val="20"/>
+        </w:rPr>
+        <w:t>retest_registry.py</w:t>
+      </w:r>
+      <w:r>
+        <w:rPr>
+          <w:sz w:val="22"/>
+        </w:rPr>
+        <w:t xml:space="preserve">, </w:t>
+      </w:r>
+      <w:r>
+        <w:rPr>
+          <w:rFonts w:ascii="Consolas" w:hAnsi="Consolas"/>
+          <w:color w:val="8A2BE2"/>
+          <w:sz w:val="20"/>
+        </w:rPr>
+        <w:t>POST /findings/{id}/retest</w:t>
+      </w:r>
+      <w:r>
+        <w:rPr>
+          <w:sz w:val="22"/>
+        </w:rPr>
+        <w:t>) — a targeted, single-finding re-verification that deliberately reuses each check's own original detection logic (including its "private" helper functions) so a retest can never drift from the exact logic that earned the finding its original confirmation.</w:t>
+      </w:r>
+    </w:p>
+    <w:p>
+      <w:pPr>
+        <w:pStyle w:val="ListBullet"/>
+      </w:pPr>
+      <w:r>
+        <w:rPr>
+          <w:b/>
+          <w:sz w:val="22"/>
+        </w:rPr>
         <w:t>Attack Chain Analysis</w:t>
       </w:r>
       <w:r>
@@ -6660,6 +7005,120 @@
           <w:sz w:val="22"/>
         </w:rPr>
         <w:t xml:space="preserve"> before touching the database; API responses only ever include a masked reference.</w:t>
+      </w:r>
+    </w:p>
+    <w:p>
+      <w:pPr>
+        <w:pStyle w:val="ListBullet"/>
+      </w:pPr>
+      <w:r>
+        <w:rPr>
+          <w:b/>
+          <w:sz w:val="22"/>
+        </w:rPr>
+        <w:t>Multi-tenant data isolation</w:t>
+      </w:r>
+      <w:r>
+        <w:rPr>
+          <w:sz w:val="22"/>
+        </w:rPr>
+        <w:t xml:space="preserve"> — every resource chain (Project → Version → ScanRun → Finding) is scoped to an </w:t>
+      </w:r>
+      <w:r>
+        <w:rPr>
+          <w:rFonts w:ascii="Consolas" w:hAnsi="Consolas"/>
+          <w:sz w:val="20"/>
+        </w:rPr>
+        <w:t>org_id</w:t>
+      </w:r>
+      <w:r>
+        <w:rPr>
+          <w:sz w:val="22"/>
+        </w:rPr>
+        <w:t xml:space="preserve">, and every API route resolves through the authenticated user's own </w:t>
+      </w:r>
+      <w:r>
+        <w:rPr>
+          <w:rFonts w:ascii="Consolas" w:hAnsi="Consolas"/>
+          <w:sz w:val="20"/>
+        </w:rPr>
+        <w:t>org_id</w:t>
+      </w:r>
+      <w:r>
+        <w:rPr>
+          <w:sz w:val="22"/>
+        </w:rPr>
+        <w:t xml:space="preserve"> before touching anything — one org's scan data is never queryable by another org's users at the query layer, not just hidden in the UI.</w:t>
+      </w:r>
+    </w:p>
+    <w:p>
+      <w:pPr>
+        <w:pStyle w:val="ListBullet"/>
+      </w:pPr>
+      <w:r>
+        <w:rPr>
+          <w:b/>
+          <w:sz w:val="22"/>
+        </w:rPr>
+        <w:t>What leaves the organization's own infrastructure, and what doesn't</w:t>
+      </w:r>
+      <w:r>
+        <w:rPr>
+          <w:sz w:val="22"/>
+        </w:rPr>
+        <w:t xml:space="preserve"> — the one genuine third-party data flow is AI-assisted triage: when it runs (SQLi/XSS/access-control confirmation, business-logic hypothesis generation), truncated request/response snippets from the target application (~2000 characters, centered on the relevant diff) go to whichever LLM provider is configured for that scan. By default that's a hosted provider (Claude, OpenAI, Gemini, or Grok — §6) — real, unavoidable third-party egress for that data, the same as any product built on a hosted LLM. Two ways to eliminate it entirely, both already supported with no code changes: point the AI provider config at a </w:t>
+      </w:r>
+      <w:r>
+        <w:rPr>
+          <w:b/>
+          <w:sz w:val="22"/>
+        </w:rPr>
+        <w:t>self-hosted/on-prem OpenAI-compatible endpoint</w:t>
+      </w:r>
+      <w:r>
+        <w:rPr>
+          <w:sz w:val="22"/>
+        </w:rPr>
+        <w:t xml:space="preserve"> (</w:t>
+      </w:r>
+      <w:r>
+        <w:rPr>
+          <w:rFonts w:ascii="Consolas" w:hAnsi="Consolas"/>
+          <w:sz w:val="20"/>
+        </w:rPr>
+        <w:t>provider: "custom"</w:t>
+      </w:r>
+      <w:r>
+        <w:rPr>
+          <w:sz w:val="22"/>
+        </w:rPr>
+        <w:t xml:space="preserve">), or run with </w:t>
+      </w:r>
+      <w:r>
+        <w:rPr>
+          <w:b/>
+          <w:sz w:val="22"/>
+        </w:rPr>
+        <w:t>no AI provider configured at all</w:t>
+      </w:r>
+      <w:r>
+        <w:rPr>
+          <w:sz w:val="22"/>
+        </w:rPr>
+        <w:t xml:space="preserve"> — every deterministic check (the majority of the check catalog: every header/cookie/TLS misconfiguration, CSRF, clickjacking, open redirect, CSP bypass, API version exposure, file upload, and more) still runs and produces real, confirmed findings; only the LLM-assisted confirmation/triage steps are skipped. Evidence (screenshots, captured request/response pairs) is stored on local disk or S3 by default — under the </w:t>
+      </w:r>
+      <w:r>
+        <w:rPr>
+          <w:i/>
+          <w:sz w:val="22"/>
+        </w:rPr>
+        <w:t>deploying organization's own</w:t>
+      </w:r>
+      <w:r>
+        <w:rPr>
+          <w:sz w:val="22"/>
+        </w:rPr>
+        <w:t xml:space="preserve"> infrastructure/AWS account, never anything Verdikt-controlled. No analytics/telemetry SDK (Sentry, PostHog, Segment, Mixpanel, or similar) exists anywhere in the codebase.</w:t>
       </w:r>
     </w:p>
     <w:p>
@@ -7816,21 +8275,13 @@
       </w:pPr>
       <w:r>
         <w:rPr>
-          <w:b/>
-          <w:sz w:val="22"/>
-        </w:rPr>
-        <w:t>119 test files, 667 collected tests</w:t>
-      </w:r>
-      <w:r>
-        <w:rPr>
-          <w:sz w:val="22"/>
-        </w:rPr>
-        <w:t xml:space="preserve"> — confirmed by running </w:t>
+          <w:sz w:val="22"/>
+        </w:rPr>
+        <w:t xml:space="preserve">126 test files, 721 collected tests — confirmed by running </w:t>
       </w:r>
       <w:r>
         <w:rPr>
           <w:rFonts w:ascii="Consolas" w:hAnsi="Consolas"/>
-          <w:color w:val="8A2BE2"/>
           <w:sz w:val="20"/>
         </w:rPr>
         <w:t>pytest --collect-only</w:t>
@@ -7859,16 +8310,9 @@
       </w:pPr>
       <w:r>
         <w:rPr>
-          <w:b/>
-          <w:sz w:val="22"/>
-        </w:rPr>
-        <w:t>Live-validated</w:t>
-      </w:r>
-      <w:r>
-        <w:rPr>
-          <w:sz w:val="22"/>
-        </w:rPr>
-        <w:t>, not just unit-tested: run against a real, running OWASP Juice Shop instance and a real DVWA instance across all four of its security levels (Low, Medium, High, Impossible), with results manually cross-checked against what's actually exploitable at each level.</w:t>
+          <w:sz w:val="22"/>
+        </w:rPr>
+        <w:t>Live-validated, not just unit-tested: run against a real, running OWASP Juice Shop instance and a real DVWA instance across all four of its security levels (Low, Medium, High, Impossible), with results manually cross-checked against what's actually exploitable at each level. The Chatbot/LLM Pentest capability (§7) was additionally validated end to end against a real local fixture chatbot server for each of its 5 checks, and again in a combined demo run covering all four target categories in one pass: a traditional web app (DVWA), a JavaScript SPA (Juice Shop), a JSON REST API (a purpose-built vulnerable fixture with a real BOLA and real SQL injection), and an LLM-backed chatbot (a purpose-built fixture triggering all 5 chatbot checks) — real scans through the real product against all four, not simulated.</w:t>
       </w:r>
     </w:p>
     <w:p>
@@ -8818,101 +9262,108 @@
             <w:tcW w:type="dxa" w:w="2880"/>
           </w:tcPr>
           <w:p>
-            <w:r>
-              <w:rPr>
-                <w:rFonts w:ascii="Consolas" w:hAnsi="Consolas"/>
-                <w:color w:val="8A2BE2"/>
-                <w:sz w:val="16"/>
+            <w:r/>
+            <w:r>
+              <w:rPr>
+                <w:rFonts w:ascii="Consolas" w:hAnsi="Consolas"/>
+                <w:sz w:val="20"/>
               </w:rPr>
               <w:t>version_id</w:t>
             </w:r>
             <w:r>
               <w:rPr>
-                <w:sz w:val="18"/>
+                <w:sz w:val="22"/>
               </w:rPr>
               <w:t xml:space="preserve">, </w:t>
             </w:r>
             <w:r>
               <w:rPr>
                 <w:rFonts w:ascii="Consolas" w:hAnsi="Consolas"/>
-                <w:color w:val="8A2BE2"/>
-                <w:sz w:val="16"/>
+                <w:sz w:val="20"/>
               </w:rPr>
               <w:t>credential_type</w:t>
             </w:r>
             <w:r>
               <w:rPr>
-                <w:sz w:val="18"/>
+                <w:sz w:val="22"/>
               </w:rPr>
               <w:t xml:space="preserve">, </w:t>
             </w:r>
             <w:r>
               <w:rPr>
                 <w:rFonts w:ascii="Consolas" w:hAnsi="Consolas"/>
-                <w:color w:val="8A2BE2"/>
-                <w:sz w:val="16"/>
+                <w:sz w:val="20"/>
               </w:rPr>
               <w:t>encrypted_secret</w:t>
             </w:r>
             <w:r>
               <w:rPr>
-                <w:sz w:val="18"/>
+                <w:sz w:val="22"/>
               </w:rPr>
               <w:t xml:space="preserve">, </w:t>
             </w:r>
             <w:r>
               <w:rPr>
                 <w:rFonts w:ascii="Consolas" w:hAnsi="Consolas"/>
-                <w:color w:val="8A2BE2"/>
-                <w:sz w:val="16"/>
+                <w:sz w:val="20"/>
               </w:rPr>
               <w:t>login_endpoint</w:t>
             </w:r>
             <w:r>
               <w:rPr>
-                <w:sz w:val="18"/>
+                <w:sz w:val="22"/>
               </w:rPr>
               <w:t xml:space="preserve">, </w:t>
             </w:r>
             <w:r>
               <w:rPr>
                 <w:rFonts w:ascii="Consolas" w:hAnsi="Consolas"/>
-                <w:color w:val="8A2BE2"/>
-                <w:sz w:val="16"/>
+                <w:sz w:val="20"/>
               </w:rPr>
               <w:t>login_body_template</w:t>
             </w:r>
             <w:r>
               <w:rPr>
-                <w:sz w:val="18"/>
+                <w:sz w:val="22"/>
               </w:rPr>
               <w:t xml:space="preserve">, </w:t>
             </w:r>
             <w:r>
               <w:rPr>
                 <w:rFonts w:ascii="Consolas" w:hAnsi="Consolas"/>
-                <w:color w:val="8A2BE2"/>
-                <w:sz w:val="16"/>
+                <w:sz w:val="20"/>
               </w:rPr>
               <w:t>token_response_path</w:t>
             </w:r>
             <w:r>
               <w:rPr>
-                <w:sz w:val="18"/>
+                <w:sz w:val="22"/>
               </w:rPr>
               <w:t xml:space="preserve">, </w:t>
             </w:r>
             <w:r>
               <w:rPr>
                 <w:rFonts w:ascii="Consolas" w:hAnsi="Consolas"/>
-                <w:color w:val="8A2BE2"/>
-                <w:sz w:val="16"/>
+                <w:sz w:val="20"/>
               </w:rPr>
               <w:t>extra_cookies</w:t>
             </w:r>
             <w:r>
               <w:rPr>
-                <w:sz w:val="18"/>
+                <w:sz w:val="22"/>
+              </w:rPr>
+              <w:t xml:space="preserve"> (JSON), </w:t>
+            </w:r>
+            <w:r>
+              <w:rPr>
+                <w:rFonts w:ascii="Consolas" w:hAnsi="Consolas"/>
+                <w:sz w:val="20"/>
+              </w:rPr>
+              <w:t>extra_headers</w:t>
+            </w:r>
+            <w:r>
+              <w:rPr>
+                <w:sz w:val="22"/>
               </w:rPr>
               <w:t xml:space="preserve"> (JSON)</w:t>
             </w:r>
@@ -11856,6 +12307,239 @@
           </w:p>
         </w:tc>
       </w:tr>
+      <w:tr>
+        <w:tc>
+          <w:tcPr>
+            <w:tcW w:type="dxa" w:w="2880"/>
+          </w:tcPr>
+          <w:p>
+            <w:r/>
+            <w:r>
+              <w:rPr>
+                <w:sz w:val="22"/>
+              </w:rPr>
+              <w:t>ChatbotTarget</w:t>
+            </w:r>
+          </w:p>
+        </w:tc>
+        <w:tc>
+          <w:tcPr>
+            <w:tcW w:type="dxa" w:w="2880"/>
+          </w:tcPr>
+          <w:p>
+            <w:r/>
+            <w:r>
+              <w:rPr>
+                <w:sz w:val="22"/>
+              </w:rPr>
+              <w:t>chatbot_targets</w:t>
+            </w:r>
+          </w:p>
+        </w:tc>
+        <w:tc>
+          <w:tcPr>
+            <w:tcW w:type="dxa" w:w="2880"/>
+          </w:tcPr>
+          <w:p>
+            <w:r/>
+            <w:r>
+              <w:rPr>
+                <w:rFonts w:ascii="Consolas" w:hAnsi="Consolas"/>
+                <w:sz w:val="20"/>
+              </w:rPr>
+              <w:t>version_id</w:t>
+            </w:r>
+            <w:r>
+              <w:rPr>
+                <w:sz w:val="22"/>
+              </w:rPr>
+              <w:t xml:space="preserve">, </w:t>
+            </w:r>
+            <w:r>
+              <w:rPr>
+                <w:rFonts w:ascii="Consolas" w:hAnsi="Consolas"/>
+                <w:sz w:val="20"/>
+              </w:rPr>
+              <w:t>endpoint_url</w:t>
+            </w:r>
+            <w:r>
+              <w:rPr>
+                <w:sz w:val="22"/>
+              </w:rPr>
+              <w:t xml:space="preserve">, </w:t>
+            </w:r>
+            <w:r>
+              <w:rPr>
+                <w:rFonts w:ascii="Consolas" w:hAnsi="Consolas"/>
+                <w:sz w:val="20"/>
+              </w:rPr>
+              <w:t>http_method</w:t>
+            </w:r>
+            <w:r>
+              <w:rPr>
+                <w:sz w:val="22"/>
+              </w:rPr>
+              <w:t xml:space="preserve">, </w:t>
+            </w:r>
+            <w:r>
+              <w:rPr>
+                <w:rFonts w:ascii="Consolas" w:hAnsi="Consolas"/>
+                <w:sz w:val="20"/>
+              </w:rPr>
+              <w:t>request_body_template</w:t>
+            </w:r>
+            <w:r>
+              <w:rPr>
+                <w:sz w:val="22"/>
+              </w:rPr>
+              <w:t xml:space="preserve"> (</w:t>
+            </w:r>
+            <w:r>
+              <w:rPr>
+                <w:rFonts w:ascii="Consolas" w:hAnsi="Consolas"/>
+                <w:sz w:val="20"/>
+              </w:rPr>
+              <w:t>{message}</w:t>
+            </w:r>
+            <w:r>
+              <w:rPr>
+                <w:sz w:val="22"/>
+              </w:rPr>
+              <w:t xml:space="preserve"> placeholder), </w:t>
+            </w:r>
+            <w:r>
+              <w:rPr>
+                <w:rFonts w:ascii="Consolas" w:hAnsi="Consolas"/>
+                <w:sz w:val="20"/>
+              </w:rPr>
+              <w:t>content_type</w:t>
+            </w:r>
+            <w:r>
+              <w:rPr>
+                <w:sz w:val="22"/>
+              </w:rPr>
+              <w:t xml:space="preserve">, </w:t>
+            </w:r>
+            <w:r>
+              <w:rPr>
+                <w:rFonts w:ascii="Consolas" w:hAnsi="Consolas"/>
+                <w:sz w:val="20"/>
+              </w:rPr>
+              <w:t>response_text_path</w:t>
+            </w:r>
+            <w:r>
+              <w:rPr>
+                <w:sz w:val="22"/>
+              </w:rPr>
+              <w:t xml:space="preserve">, </w:t>
+            </w:r>
+            <w:r>
+              <w:rPr>
+                <w:rFonts w:ascii="Consolas" w:hAnsi="Consolas"/>
+                <w:sz w:val="20"/>
+              </w:rPr>
+              <w:t>auth_header_name</w:t>
+            </w:r>
+            <w:r>
+              <w:rPr>
+                <w:sz w:val="22"/>
+              </w:rPr>
+              <w:t xml:space="preserve">, </w:t>
+            </w:r>
+            <w:r>
+              <w:rPr>
+                <w:rFonts w:ascii="Consolas" w:hAnsi="Consolas"/>
+                <w:sz w:val="20"/>
+              </w:rPr>
+              <w:t>encrypted_auth_header_value</w:t>
+            </w:r>
+            <w:r>
+              <w:rPr>
+                <w:sz w:val="22"/>
+              </w:rPr>
+              <w:t xml:space="preserve">, </w:t>
+            </w:r>
+            <w:r>
+              <w:rPr>
+                <w:rFonts w:ascii="Consolas" w:hAnsi="Consolas"/>
+                <w:sz w:val="20"/>
+              </w:rPr>
+              <w:t>masked_reference</w:t>
+            </w:r>
+          </w:p>
+        </w:tc>
+      </w:tr>
+      <w:tr>
+        <w:tc>
+          <w:tcPr>
+            <w:tcW w:type="dxa" w:w="2880"/>
+          </w:tcPr>
+          <w:p>
+            <w:r/>
+            <w:r>
+              <w:rPr>
+                <w:sz w:val="22"/>
+              </w:rPr>
+              <w:t>ChatbotAgencyProbe</w:t>
+            </w:r>
+          </w:p>
+        </w:tc>
+        <w:tc>
+          <w:tcPr>
+            <w:tcW w:type="dxa" w:w="2880"/>
+          </w:tcPr>
+          <w:p>
+            <w:r/>
+            <w:r>
+              <w:rPr>
+                <w:sz w:val="22"/>
+              </w:rPr>
+              <w:t>chatbot_agency_probes</w:t>
+            </w:r>
+          </w:p>
+        </w:tc>
+        <w:tc>
+          <w:tcPr>
+            <w:tcW w:type="dxa" w:w="2880"/>
+          </w:tcPr>
+          <w:p>
+            <w:r/>
+            <w:r>
+              <w:rPr>
+                <w:rFonts w:ascii="Consolas" w:hAnsi="Consolas"/>
+                <w:sz w:val="20"/>
+              </w:rPr>
+              <w:t>chatbot_target_id</w:t>
+            </w:r>
+            <w:r>
+              <w:rPr>
+                <w:sz w:val="22"/>
+              </w:rPr>
+              <w:t xml:space="preserve">→chatbot_targets CASCADE, </w:t>
+            </w:r>
+            <w:r>
+              <w:rPr>
+                <w:rFonts w:ascii="Consolas" w:hAnsi="Consolas"/>
+                <w:sz w:val="20"/>
+              </w:rPr>
+              <w:t>forbidden_action</w:t>
+            </w:r>
+            <w:r>
+              <w:rPr>
+                <w:sz w:val="22"/>
+              </w:rPr>
+              <w:t xml:space="preserve"> (Text), </w:t>
+            </w:r>
+            <w:r>
+              <w:rPr>
+                <w:rFonts w:ascii="Consolas" w:hAnsi="Consolas"/>
+                <w:sz w:val="20"/>
+              </w:rPr>
+              <w:t>created_by</w:t>
+            </w:r>
+          </w:p>
+        </w:tc>
+      </w:tr>
     </w:tbl>
     <w:p/>
     <w:p>
@@ -11880,7 +12564,10 @@
         <w:pStyle w:val="Heading2"/>
       </w:pPr>
       <w:r>
-        <w:t>16. Appendix — Full API Route Reference (30 modules)</w:t>
+        <w:rPr>
+          <w:sz w:val="22"/>
+        </w:rPr>
+        <w:t>16. Appendix — Full API Route Reference (32 modules)</w:t>
       </w:r>
     </w:p>
     <w:tbl>
@@ -12414,137 +13101,154 @@
             <w:tcW w:type="dxa" w:w="4320"/>
           </w:tcPr>
           <w:p>
-            <w:r>
-              <w:rPr>
-                <w:rFonts w:ascii="Consolas" w:hAnsi="Consolas"/>
-                <w:color w:val="8A2BE2"/>
-                <w:sz w:val="16"/>
+            <w:r/>
+            <w:r>
+              <w:rPr>
+                <w:rFonts w:ascii="Consolas" w:hAnsi="Consolas"/>
+                <w:sz w:val="20"/>
               </w:rPr>
               <w:t>POST /credentials</w:t>
             </w:r>
             <w:r>
               <w:rPr>
-                <w:sz w:val="18"/>
+                <w:sz w:val="22"/>
+              </w:rPr>
+              <w:t xml:space="preserve"> (accepts </w:t>
+            </w:r>
+            <w:r>
+              <w:rPr>
+                <w:rFonts w:ascii="Consolas" w:hAnsi="Consolas"/>
+                <w:sz w:val="20"/>
+              </w:rPr>
+              <w:t>extra_cookies</w:t>
+            </w:r>
+            <w:r>
+              <w:rPr>
+                <w:sz w:val="22"/>
+              </w:rPr>
+              <w:t>/</w:t>
+            </w:r>
+            <w:r>
+              <w:rPr>
+                <w:rFonts w:ascii="Consolas" w:hAnsi="Consolas"/>
+                <w:sz w:val="20"/>
+              </w:rPr>
+              <w:t>extra_headers</w:t>
+            </w:r>
+            <w:r>
+              <w:rPr>
+                <w:sz w:val="22"/>
+              </w:rPr>
+              <w:t xml:space="preserve">), </w:t>
+            </w:r>
+            <w:r>
+              <w:rPr>
+                <w:rFonts w:ascii="Consolas" w:hAnsi="Consolas"/>
+                <w:sz w:val="20"/>
+              </w:rPr>
+              <w:t>GET /credentials</w:t>
+            </w:r>
+            <w:r>
+              <w:rPr>
+                <w:sz w:val="22"/>
               </w:rPr>
               <w:t xml:space="preserve">, </w:t>
             </w:r>
             <w:r>
               <w:rPr>
                 <w:rFonts w:ascii="Consolas" w:hAnsi="Consolas"/>
-                <w:color w:val="8A2BE2"/>
-                <w:sz w:val="16"/>
-              </w:rPr>
-              <w:t>GET /credentials</w:t>
-            </w:r>
-            <w:r>
-              <w:rPr>
-                <w:sz w:val="18"/>
+                <w:sz w:val="20"/>
+              </w:rPr>
+              <w:t>PATCH /credentials/{id}</w:t>
+            </w:r>
+            <w:r>
+              <w:rPr>
+                <w:sz w:val="22"/>
               </w:rPr>
               <w:t xml:space="preserve">, </w:t>
             </w:r>
             <w:r>
               <w:rPr>
                 <w:rFonts w:ascii="Consolas" w:hAnsi="Consolas"/>
-                <w:color w:val="8A2BE2"/>
-                <w:sz w:val="16"/>
-              </w:rPr>
-              <w:t>PATCH /credentials/{id}</w:t>
-            </w:r>
-            <w:r>
-              <w:rPr>
-                <w:sz w:val="18"/>
+                <w:sz w:val="20"/>
+              </w:rPr>
+              <w:t>DELETE /credentials/{id}</w:t>
+            </w:r>
+            <w:r>
+              <w:rPr>
+                <w:sz w:val="22"/>
               </w:rPr>
               <w:t xml:space="preserve">, </w:t>
             </w:r>
             <w:r>
               <w:rPr>
                 <w:rFonts w:ascii="Consolas" w:hAnsi="Consolas"/>
-                <w:color w:val="8A2BE2"/>
-                <w:sz w:val="16"/>
-              </w:rPr>
-              <w:t>DELETE /credentials/{id}</w:t>
-            </w:r>
-            <w:r>
-              <w:rPr>
-                <w:sz w:val="18"/>
+                <w:sz w:val="20"/>
+              </w:rPr>
+              <w:t>POST /credentials/{id}/test-login</w:t>
+            </w:r>
+            <w:r>
+              <w:rPr>
+                <w:sz w:val="22"/>
               </w:rPr>
               <w:t xml:space="preserve">, </w:t>
             </w:r>
             <w:r>
               <w:rPr>
                 <w:rFonts w:ascii="Consolas" w:hAnsi="Consolas"/>
-                <w:color w:val="8A2BE2"/>
-                <w:sz w:val="16"/>
-              </w:rPr>
-              <w:t>POST /credentials/{id}/test-login</w:t>
-            </w:r>
-            <w:r>
-              <w:rPr>
-                <w:sz w:val="18"/>
+                <w:sz w:val="20"/>
+              </w:rPr>
+              <w:t>POST /credentials/{id}/record-macro/start</w:t>
+            </w:r>
+            <w:r>
+              <w:rPr>
+                <w:sz w:val="22"/>
               </w:rPr>
               <w:t xml:space="preserve">, </w:t>
             </w:r>
             <w:r>
               <w:rPr>
                 <w:rFonts w:ascii="Consolas" w:hAnsi="Consolas"/>
-                <w:color w:val="8A2BE2"/>
-                <w:sz w:val="16"/>
-              </w:rPr>
-              <w:t>POST /credentials/{id}/record-macro/start</w:t>
-            </w:r>
-            <w:r>
-              <w:rPr>
-                <w:sz w:val="18"/>
+                <w:sz w:val="20"/>
+              </w:rPr>
+              <w:t>POST /credentials/{id}/record-macro/{recording_id}/finish</w:t>
+            </w:r>
+            <w:r>
+              <w:rPr>
+                <w:sz w:val="22"/>
               </w:rPr>
               <w:t xml:space="preserve">, </w:t>
             </w:r>
             <w:r>
               <w:rPr>
                 <w:rFonts w:ascii="Consolas" w:hAnsi="Consolas"/>
-                <w:color w:val="8A2BE2"/>
-                <w:sz w:val="16"/>
-              </w:rPr>
-              <w:t>POST /credentials/{id}/record-macro/{recording_id}/finish</w:t>
-            </w:r>
-            <w:r>
-              <w:rPr>
-                <w:sz w:val="18"/>
+                <w:sz w:val="20"/>
+              </w:rPr>
+              <w:t>POST /credentials/{id}/record-macro/{recording_id}/cancel</w:t>
+            </w:r>
+            <w:r>
+              <w:rPr>
+                <w:sz w:val="22"/>
               </w:rPr>
               <w:t xml:space="preserve">, </w:t>
             </w:r>
             <w:r>
               <w:rPr>
                 <w:rFonts w:ascii="Consolas" w:hAnsi="Consolas"/>
-                <w:color w:val="8A2BE2"/>
-                <w:sz w:val="16"/>
-              </w:rPr>
-              <w:t>POST /credentials/{id}/record-macro/{recording_id}/cancel</w:t>
-            </w:r>
-            <w:r>
-              <w:rPr>
-                <w:sz w:val="18"/>
+                <w:sz w:val="20"/>
+              </w:rPr>
+              <w:t>GET /credentials/{id}/macros</w:t>
+            </w:r>
+            <w:r>
+              <w:rPr>
+                <w:sz w:val="22"/>
               </w:rPr>
               <w:t xml:space="preserve">, </w:t>
             </w:r>
             <w:r>
               <w:rPr>
                 <w:rFonts w:ascii="Consolas" w:hAnsi="Consolas"/>
-                <w:color w:val="8A2BE2"/>
-                <w:sz w:val="16"/>
-              </w:rPr>
-              <w:t>GET /credentials/{id}/macros</w:t>
-            </w:r>
-            <w:r>
-              <w:rPr>
-                <w:sz w:val="18"/>
-              </w:rPr>
-              <w:t xml:space="preserve">, </w:t>
-            </w:r>
-            <w:r>
-              <w:rPr>
-                <w:rFonts w:ascii="Consolas" w:hAnsi="Consolas"/>
-                <w:color w:val="8A2BE2"/>
-                <w:sz w:val="16"/>
+                <w:sz w:val="20"/>
               </w:rPr>
               <w:t>DELETE /credentials/{id}/macros/{macro_id}</w:t>
             </w:r>
@@ -14201,6 +14905,120 @@
           </w:p>
         </w:tc>
       </w:tr>
+      <w:tr>
+        <w:tc>
+          <w:tcPr>
+            <w:tcW w:type="dxa" w:w="4320"/>
+          </w:tcPr>
+          <w:p>
+            <w:r/>
+            <w:r>
+              <w:rPr>
+                <w:sz w:val="22"/>
+              </w:rPr>
+              <w:t>chatbot_targets.py</w:t>
+            </w:r>
+          </w:p>
+        </w:tc>
+        <w:tc>
+          <w:tcPr>
+            <w:tcW w:type="dxa" w:w="4320"/>
+          </w:tcPr>
+          <w:p>
+            <w:r/>
+            <w:r>
+              <w:rPr>
+                <w:rFonts w:ascii="Consolas" w:hAnsi="Consolas"/>
+                <w:sz w:val="20"/>
+              </w:rPr>
+              <w:t>POST /versions/{id}/chatbot-targets</w:t>
+            </w:r>
+            <w:r>
+              <w:rPr>
+                <w:sz w:val="22"/>
+              </w:rPr>
+              <w:t xml:space="preserve">, </w:t>
+            </w:r>
+            <w:r>
+              <w:rPr>
+                <w:rFonts w:ascii="Consolas" w:hAnsi="Consolas"/>
+                <w:sz w:val="20"/>
+              </w:rPr>
+              <w:t>GET /versions/{id}/chatbot-targets</w:t>
+            </w:r>
+            <w:r>
+              <w:rPr>
+                <w:sz w:val="22"/>
+              </w:rPr>
+              <w:t xml:space="preserve">, </w:t>
+            </w:r>
+            <w:r>
+              <w:rPr>
+                <w:rFonts w:ascii="Consolas" w:hAnsi="Consolas"/>
+                <w:sz w:val="20"/>
+              </w:rPr>
+              <w:t>DELETE /versions/{id}/chatbot-targets/{target_id}</w:t>
+            </w:r>
+          </w:p>
+        </w:tc>
+      </w:tr>
+      <w:tr>
+        <w:tc>
+          <w:tcPr>
+            <w:tcW w:type="dxa" w:w="4320"/>
+          </w:tcPr>
+          <w:p>
+            <w:r/>
+            <w:r>
+              <w:rPr>
+                <w:sz w:val="22"/>
+              </w:rPr>
+              <w:t>chatbot_agency_probes.py</w:t>
+            </w:r>
+          </w:p>
+        </w:tc>
+        <w:tc>
+          <w:tcPr>
+            <w:tcW w:type="dxa" w:w="4320"/>
+          </w:tcPr>
+          <w:p>
+            <w:r/>
+            <w:r>
+              <w:rPr>
+                <w:rFonts w:ascii="Consolas" w:hAnsi="Consolas"/>
+                <w:sz w:val="20"/>
+              </w:rPr>
+              <w:t>POST /versions/{id}/chatbot-targets/{target_id}/agency-probes</w:t>
+            </w:r>
+            <w:r>
+              <w:rPr>
+                <w:sz w:val="22"/>
+              </w:rPr>
+              <w:t xml:space="preserve">, </w:t>
+            </w:r>
+            <w:r>
+              <w:rPr>
+                <w:rFonts w:ascii="Consolas" w:hAnsi="Consolas"/>
+                <w:sz w:val="20"/>
+              </w:rPr>
+              <w:t>GET /versions/{id}/chatbot-targets/{target_id}/agency-probes</w:t>
+            </w:r>
+            <w:r>
+              <w:rPr>
+                <w:sz w:val="22"/>
+              </w:rPr>
+              <w:t xml:space="preserve">, </w:t>
+            </w:r>
+            <w:r>
+              <w:rPr>
+                <w:rFonts w:ascii="Consolas" w:hAnsi="Consolas"/>
+                <w:sz w:val="20"/>
+              </w:rPr>
+              <w:t>DELETE /versions/{id}/chatbot-targets/{target_id}/agency-probes/{probe_id}</w:t>
+            </w:r>
+          </w:p>
+        </w:tc>
+      </w:tr>
     </w:tbl>
     <w:p/>
     <w:p>
@@ -14208,7 +15026,10 @@
         <w:pStyle w:val="Heading2"/>
       </w:pPr>
       <w:r>
-        <w:t>17. Appendix — Full Check Catalog (39 static IDs + dynamic IDs)</w:t>
+        <w:rPr>
+          <w:sz w:val="22"/>
+        </w:rPr>
+        <w:t>17. Appendix — Full Check Catalog (47 static IDs + dynamic IDs)</w:t>
       </w:r>
     </w:p>
     <w:tbl>
@@ -15271,6 +16092,206 @@
                 <w:sz w:val="18"/>
               </w:rPr>
               <w:t xml:space="preserve"> (High/611)</w:t>
+            </w:r>
+          </w:p>
+        </w:tc>
+      </w:tr>
+      <w:tr>
+        <w:tc>
+          <w:tcPr>
+            <w:tcW w:type="dxa" w:w="4320"/>
+          </w:tcPr>
+          <w:p>
+            <w:r/>
+            <w:r>
+              <w:rPr>
+                <w:sz w:val="22"/>
+              </w:rPr>
+              <w:t>api_version_catalog.yaml</w:t>
+            </w:r>
+          </w:p>
+        </w:tc>
+        <w:tc>
+          <w:tcPr>
+            <w:tcW w:type="dxa" w:w="4320"/>
+          </w:tcPr>
+          <w:p>
+            <w:r/>
+            <w:r>
+              <w:rPr>
+                <w:rFonts w:ascii="Consolas" w:hAnsi="Consolas"/>
+                <w:sz w:val="20"/>
+              </w:rPr>
+              <w:t>api-deprecated-version-excessive-data-exposure</w:t>
+            </w:r>
+            <w:r>
+              <w:rPr>
+                <w:sz w:val="22"/>
+              </w:rPr>
+              <w:t xml:space="preserve"> (High/213)</w:t>
+            </w:r>
+          </w:p>
+        </w:tc>
+      </w:tr>
+      <w:tr>
+        <w:tc>
+          <w:tcPr>
+            <w:tcW w:type="dxa" w:w="4320"/>
+          </w:tcPr>
+          <w:p>
+            <w:r/>
+            <w:r>
+              <w:rPr>
+                <w:sz w:val="22"/>
+              </w:rPr>
+              <w:t>csp_bypass_catalog.yaml</w:t>
+            </w:r>
+          </w:p>
+        </w:tc>
+        <w:tc>
+          <w:tcPr>
+            <w:tcW w:type="dxa" w:w="4320"/>
+          </w:tcPr>
+          <w:p>
+            <w:r/>
+            <w:r>
+              <w:rPr>
+                <w:rFonts w:ascii="Consolas" w:hAnsi="Consolas"/>
+                <w:sz w:val="20"/>
+              </w:rPr>
+              <w:t>csp-bypass-jsonp-callback</w:t>
+            </w:r>
+            <w:r>
+              <w:rPr>
+                <w:sz w:val="22"/>
+              </w:rPr>
+              <w:t xml:space="preserve"> (High/693)</w:t>
+            </w:r>
+          </w:p>
+        </w:tc>
+      </w:tr>
+      <w:tr>
+        <w:tc>
+          <w:tcPr>
+            <w:tcW w:type="dxa" w:w="4320"/>
+          </w:tcPr>
+          <w:p>
+            <w:r/>
+            <w:r>
+              <w:rPr>
+                <w:sz w:val="22"/>
+              </w:rPr>
+              <w:t>open_redirect_catalog.yaml</w:t>
+            </w:r>
+          </w:p>
+        </w:tc>
+        <w:tc>
+          <w:tcPr>
+            <w:tcW w:type="dxa" w:w="4320"/>
+          </w:tcPr>
+          <w:p>
+            <w:r/>
+            <w:r>
+              <w:rPr>
+                <w:rFonts w:ascii="Consolas" w:hAnsi="Consolas"/>
+                <w:sz w:val="20"/>
+              </w:rPr>
+              <w:t>open-redirect-confirmed</w:t>
+            </w:r>
+            <w:r>
+              <w:rPr>
+                <w:sz w:val="22"/>
+              </w:rPr>
+              <w:t xml:space="preserve"> (Medium/601)</w:t>
+            </w:r>
+          </w:p>
+        </w:tc>
+      </w:tr>
+      <w:tr>
+        <w:tc>
+          <w:tcPr>
+            <w:tcW w:type="dxa" w:w="4320"/>
+          </w:tcPr>
+          <w:p>
+            <w:r/>
+            <w:r>
+              <w:rPr>
+                <w:sz w:val="22"/>
+              </w:rPr>
+              <w:t>chatbot_injection_catalog.yaml</w:t>
+            </w:r>
+          </w:p>
+        </w:tc>
+        <w:tc>
+          <w:tcPr>
+            <w:tcW w:type="dxa" w:w="4320"/>
+          </w:tcPr>
+          <w:p>
+            <w:r/>
+            <w:r>
+              <w:rPr>
+                <w:rFonts w:ascii="Consolas" w:hAnsi="Consolas"/>
+                <w:sz w:val="20"/>
+              </w:rPr>
+              <w:t>chatbot-prompt-injection-direct</w:t>
+            </w:r>
+            <w:r>
+              <w:rPr>
+                <w:sz w:val="22"/>
+              </w:rPr>
+              <w:t xml:space="preserve"> (High/1427, LLM01), </w:t>
+            </w:r>
+            <w:r>
+              <w:rPr>
+                <w:rFonts w:ascii="Consolas" w:hAnsi="Consolas"/>
+                <w:sz w:val="20"/>
+              </w:rPr>
+              <w:t>chatbot-system-prompt-extraction</w:t>
+            </w:r>
+            <w:r>
+              <w:rPr>
+                <w:sz w:val="22"/>
+              </w:rPr>
+              <w:t xml:space="preserve"> (Medium/200, LLM08), </w:t>
+            </w:r>
+            <w:r>
+              <w:rPr>
+                <w:rFonts w:ascii="Consolas" w:hAnsi="Consolas"/>
+                <w:sz w:val="20"/>
+              </w:rPr>
+              <w:t>chatbot-improper-output-handling</w:t>
+            </w:r>
+            <w:r>
+              <w:rPr>
+                <w:sz w:val="22"/>
+              </w:rPr>
+              <w:t xml:space="preserve"> (Medium/79, LLM10), </w:t>
+            </w:r>
+            <w:r>
+              <w:rPr>
+                <w:rFonts w:ascii="Consolas" w:hAnsi="Consolas"/>
+                <w:sz w:val="20"/>
+              </w:rPr>
+              <w:t>chatbot-excessive-agency</w:t>
+            </w:r>
+            <w:r>
+              <w:rPr>
+                <w:sz w:val="22"/>
+              </w:rPr>
+              <w:t xml:space="preserve"> (High/863, LLM03), </w:t>
+            </w:r>
+            <w:r>
+              <w:rPr>
+                <w:rFonts w:ascii="Consolas" w:hAnsi="Consolas"/>
+                <w:sz w:val="20"/>
+              </w:rPr>
+              <w:t>chatbot-unexpected-code-execution</w:t>
+            </w:r>
+            <w:r>
+              <w:rPr>
+                <w:sz w:val="22"/>
+              </w:rPr>
+              <w:t xml:space="preserve"> (Critical/94, ASI05) — see §7</w:t>
             </w:r>
           </w:p>
         </w:tc>
@@ -17077,813 +18098,26 @@
         <w:pStyle w:val="Heading2"/>
       </w:pPr>
       <w:r>
-        <w:t>20. Appendix — Migration History (36 files, one linear chain)</w:t>
+        <w:rPr>
+          <w:sz w:val="22"/>
+        </w:rPr>
+        <w:t>20. Appendix — Migration History (39 files, one linear chain)</w:t>
       </w:r>
     </w:p>
     <w:p>
       <w:r>
         <w:rPr>
-          <w:rFonts w:ascii="Consolas" w:hAnsi="Consolas"/>
-          <w:color w:val="1C1E21"/>
-          <w:sz w:val="20"/>
-        </w:rPr>
-        <w:t>0001_initial_schema</w:t>
-      </w:r>
-      <w:r>
-        <w:rPr>
-          <w:color w:val="1C1E21"/>
-          <w:sz w:val="22"/>
-        </w:rPr>
-        <w:t xml:space="preserve"> → </w:t>
-      </w:r>
-      <w:r>
-        <w:rPr>
-          <w:rFonts w:ascii="Consolas" w:hAnsi="Consolas"/>
-          <w:color w:val="1C1E21"/>
-          <w:sz w:val="20"/>
-        </w:rPr>
-        <w:t>0001b_widen_alembic_version_column</w:t>
-      </w:r>
-      <w:r>
-        <w:rPr>
-          <w:color w:val="1C1E21"/>
-          <w:sz w:val="22"/>
-        </w:rPr>
-        <w:t xml:space="preserve"> (widens </w:t>
-      </w:r>
-      <w:r>
-        <w:rPr>
-          <w:rFonts w:ascii="Consolas" w:hAnsi="Consolas"/>
-          <w:color w:val="1C1E21"/>
-          <w:sz w:val="20"/>
-        </w:rPr>
-        <w:t>alembic_version.version_num</w:t>
-      </w:r>
-      <w:r>
-        <w:rPr>
-          <w:color w:val="1C1E21"/>
-          <w:sz w:val="22"/>
-        </w:rPr>
-        <w:t xml:space="preserve"> for this project's long revision slugs) → </w:t>
-      </w:r>
-      <w:r>
-        <w:rPr>
-          <w:rFonts w:ascii="Consolas" w:hAnsi="Consolas"/>
-          <w:color w:val="1C1E21"/>
-          <w:sz w:val="20"/>
-        </w:rPr>
-        <w:t>0002_scan_findings_and_permissions</w:t>
-      </w:r>
-      <w:r>
-        <w:rPr>
-          <w:color w:val="1C1E21"/>
-          <w:sz w:val="22"/>
-        </w:rPr>
-        <w:t xml:space="preserve"> → </w:t>
-      </w:r>
-      <w:r>
-        <w:rPr>
-          <w:rFonts w:ascii="Consolas" w:hAnsi="Consolas"/>
-          <w:color w:val="1C1E21"/>
-          <w:sz w:val="20"/>
-        </w:rPr>
-        <w:t>0003_phase2_review_candidates_and_login_config</w:t>
-      </w:r>
-      <w:r>
-        <w:rPr>
-          <w:color w:val="1C1E21"/>
-          <w:sz w:val="22"/>
-        </w:rPr>
-        <w:t xml:space="preserve"> → </w:t>
-      </w:r>
-      <w:r>
-        <w:rPr>
-          <w:rFonts w:ascii="Consolas" w:hAnsi="Consolas"/>
-          <w:color w:val="1C1E21"/>
-          <w:sz w:val="20"/>
-        </w:rPr>
-        <w:t>0004_phase3_business_rules</w:t>
-      </w:r>
-      <w:r>
-        <w:rPr>
-          <w:color w:val="1C1E21"/>
-          <w:sz w:val="22"/>
-        </w:rPr>
-        <w:t xml:space="preserve"> → </w:t>
-      </w:r>
-      <w:r>
-        <w:rPr>
-          <w:rFonts w:ascii="Consolas" w:hAnsi="Consolas"/>
-          <w:color w:val="1C1E21"/>
-          <w:sz w:val="20"/>
-        </w:rPr>
-        <w:t>0005_phase4_login_macros</w:t>
-      </w:r>
-      <w:r>
-        <w:rPr>
-          <w:color w:val="1C1E21"/>
-          <w:sz w:val="22"/>
-        </w:rPr>
-        <w:t xml:space="preserve"> → </w:t>
-      </w:r>
-      <w:r>
-        <w:rPr>
-          <w:rFonts w:ascii="Consolas" w:hAnsi="Consolas"/>
-          <w:color w:val="1C1E21"/>
-          <w:sz w:val="20"/>
-        </w:rPr>
-        <w:t>0006_phase5_executive_summary</w:t>
-      </w:r>
-      <w:r>
-        <w:rPr>
-          <w:color w:val="1C1E21"/>
-          <w:sz w:val="22"/>
-        </w:rPr>
-        <w:t xml:space="preserve"> → </w:t>
-      </w:r>
-      <w:r>
-        <w:rPr>
-          <w:rFonts w:ascii="Consolas" w:hAnsi="Consolas"/>
-          <w:color w:val="1C1E21"/>
-          <w:sz w:val="20"/>
-        </w:rPr>
-        <w:t>0007_phase6_ai_provider_configs</w:t>
-      </w:r>
-      <w:r>
-        <w:rPr>
-          <w:color w:val="1C1E21"/>
-          <w:sz w:val="22"/>
-        </w:rPr>
-        <w:t xml:space="preserve"> → </w:t>
-      </w:r>
-      <w:r>
-        <w:rPr>
-          <w:rFonts w:ascii="Consolas" w:hAnsi="Consolas"/>
-          <w:color w:val="1C1E21"/>
-          <w:sz w:val="20"/>
-        </w:rPr>
-        <w:t>0008_phase6b_oidc_sso</w:t>
-      </w:r>
-      <w:r>
-        <w:rPr>
-          <w:color w:val="1C1E21"/>
-          <w:sz w:val="22"/>
-        </w:rPr>
-        <w:t xml:space="preserve"> → </w:t>
-      </w:r>
-      <w:r>
-        <w:rPr>
-          <w:rFonts w:ascii="Consolas" w:hAnsi="Consolas"/>
-          <w:color w:val="1C1E21"/>
-          <w:sz w:val="20"/>
-        </w:rPr>
-        <w:t>0009_phase6c_api_keys</w:t>
-      </w:r>
-      <w:r>
-        <w:rPr>
-          <w:color w:val="1C1E21"/>
-          <w:sz w:val="22"/>
-        </w:rPr>
-        <w:t xml:space="preserve"> → </w:t>
-      </w:r>
-      <w:r>
-        <w:rPr>
-          <w:rFonts w:ascii="Consolas" w:hAnsi="Consolas"/>
-          <w:color w:val="1C1E21"/>
-          <w:sz w:val="20"/>
-        </w:rPr>
-        <w:t>0010_phase8_retest_jobs</w:t>
-      </w:r>
-      <w:r>
-        <w:rPr>
-          <w:color w:val="1C1E21"/>
-          <w:sz w:val="22"/>
-        </w:rPr>
-        <w:t xml:space="preserve"> → </w:t>
-      </w:r>
-      <w:r>
-        <w:rPr>
-          <w:rFonts w:ascii="Consolas" w:hAnsi="Consolas"/>
-          <w:color w:val="1C1E21"/>
-          <w:sz w:val="20"/>
-        </w:rPr>
-        <w:t>0011_phase9_ticketing_and_notifications</w:t>
-      </w:r>
-      <w:r>
-        <w:rPr>
-          <w:color w:val="1C1E21"/>
-          <w:sz w:val="22"/>
-        </w:rPr>
-        <w:t xml:space="preserve"> → </w:t>
-      </w:r>
-      <w:r>
-        <w:rPr>
-          <w:rFonts w:ascii="Consolas" w:hAnsi="Consolas"/>
-          <w:color w:val="1C1E21"/>
-          <w:sz w:val="20"/>
-        </w:rPr>
-        <w:t>0012_phase10_cmdb_and_vgs</w:t>
-      </w:r>
-      <w:r>
-        <w:rPr>
-          <w:color w:val="1C1E21"/>
-          <w:sz w:val="22"/>
-        </w:rPr>
-        <w:t xml:space="preserve"> → </w:t>
-      </w:r>
-      <w:r>
-        <w:rPr>
-          <w:rFonts w:ascii="Consolas" w:hAnsi="Consolas"/>
-          <w:color w:val="1C1E21"/>
-          <w:sz w:val="20"/>
-        </w:rPr>
-        <w:t>0013_credential_extra_cookies</w:t>
-      </w:r>
-      <w:r>
-        <w:rPr>
-          <w:color w:val="1C1E21"/>
-          <w:sz w:val="22"/>
-        </w:rPr>
-        <w:t xml:space="preserve"> → </w:t>
-      </w:r>
-      <w:r>
-        <w:rPr>
-          <w:rFonts w:ascii="Consolas" w:hAnsi="Consolas"/>
-          <w:color w:val="1C1E21"/>
-          <w:sz w:val="20"/>
-        </w:rPr>
-        <w:t>0014_phase11_extensibility_and_lifecycle</w:t>
-      </w:r>
-      <w:r>
-        <w:rPr>
-          <w:color w:val="1C1E21"/>
-          <w:sz w:val="22"/>
-        </w:rPr>
-        <w:t xml:space="preserve"> → </w:t>
-      </w:r>
-      <w:r>
-        <w:rPr>
-          <w:rFonts w:ascii="Consolas" w:hAnsi="Consolas"/>
-          <w:color w:val="1C1E21"/>
-          <w:sz w:val="20"/>
-        </w:rPr>
-        <w:t>0015_saml_org_config</w:t>
-      </w:r>
-      <w:r>
-        <w:rPr>
-          <w:color w:val="1C1E21"/>
-          <w:sz w:val="22"/>
-        </w:rPr>
-        <w:t xml:space="preserve"> → </w:t>
-      </w:r>
-      <w:r>
-        <w:rPr>
-          <w:rFonts w:ascii="Consolas" w:hAnsi="Consolas"/>
-          <w:color w:val="1C1E21"/>
-          <w:sz w:val="20"/>
-        </w:rPr>
-        <w:t>0016_org_branding</w:t>
-      </w:r>
-      <w:r>
-        <w:rPr>
-          <w:color w:val="1C1E21"/>
-          <w:sz w:val="22"/>
-        </w:rPr>
-        <w:t xml:space="preserve"> → </w:t>
-      </w:r>
-      <w:r>
-        <w:rPr>
-          <w:rFonts w:ascii="Consolas" w:hAnsi="Consolas"/>
-          <w:color w:val="1C1E21"/>
-          <w:sz w:val="20"/>
-        </w:rPr>
-        <w:t>0017_vgs_report_builder</w:t>
-      </w:r>
-      <w:r>
-        <w:rPr>
-          <w:color w:val="1C1E21"/>
-          <w:sz w:val="22"/>
-        </w:rPr>
-        <w:t xml:space="preserve"> → </w:t>
-      </w:r>
-      <w:r>
-        <w:rPr>
-          <w:rFonts w:ascii="Consolas" w:hAnsi="Consolas"/>
-          <w:color w:val="1C1E21"/>
-          <w:sz w:val="20"/>
-        </w:rPr>
-        <w:t>0018_scan_delete_cascade_and_vgs_finding_link</w:t>
-      </w:r>
-      <w:r>
-        <w:rPr>
-          <w:color w:val="1C1E21"/>
-          <w:sz w:val="22"/>
-        </w:rPr>
-        <w:t xml:space="preserve"> → </w:t>
-      </w:r>
-      <w:r>
-        <w:rPr>
-          <w:rFonts w:ascii="Consolas" w:hAnsi="Consolas"/>
-          <w:color w:val="1C1E21"/>
-          <w:sz w:val="20"/>
-        </w:rPr>
-        <w:t>0019_vgs_evidence_cascade_and_auto_seed</w:t>
-      </w:r>
-      <w:r>
-        <w:rPr>
-          <w:color w:val="1C1E21"/>
-          <w:sz w:val="22"/>
-        </w:rPr>
-        <w:t xml:space="preserve"> → </w:t>
-      </w:r>
-      <w:r>
-        <w:rPr>
-          <w:rFonts w:ascii="Consolas" w:hAnsi="Consolas"/>
-          <w:color w:val="1C1E21"/>
-          <w:sz w:val="20"/>
-        </w:rPr>
-        <w:t>0020_scan_run_warning</w:t>
-      </w:r>
-      <w:r>
-        <w:rPr>
-          <w:color w:val="1C1E21"/>
-          <w:sz w:val="22"/>
-        </w:rPr>
-        <w:t xml:space="preserve"> → </w:t>
-      </w:r>
-      <w:r>
-        <w:rPr>
-          <w:rFonts w:ascii="Consolas" w:hAnsi="Consolas"/>
-          <w:color w:val="1C1E21"/>
-          <w:sz w:val="20"/>
-        </w:rPr>
-        <w:t>0021_credential_set_delete_cascade</w:t>
-      </w:r>
-      <w:r>
-        <w:rPr>
-          <w:color w:val="1C1E21"/>
-          <w:sz w:val="22"/>
-        </w:rPr>
-        <w:t xml:space="preserve"> → </w:t>
-      </w:r>
-      <w:r>
-        <w:rPr>
-          <w:rFonts w:ascii="Consolas" w:hAnsi="Consolas"/>
-          <w:color w:val="1C1E21"/>
-          <w:sz w:val="20"/>
-        </w:rPr>
-        <w:t>0022_drop_authorization_records</w:t>
-      </w:r>
-      <w:r>
-        <w:rPr>
-          <w:color w:val="1C1E21"/>
-          <w:sz w:val="22"/>
-        </w:rPr>
-        <w:t xml:space="preserve"> (drops the table entirely) → </w:t>
-      </w:r>
-      <w:r>
-        <w:rPr>
-          <w:rFonts w:ascii="Consolas" w:hAnsi="Consolas"/>
-          <w:color w:val="1C1E21"/>
-          <w:sz w:val="20"/>
-        </w:rPr>
-        <w:t>0023_ai_provider_config_default</w:t>
-      </w:r>
-      <w:r>
-        <w:rPr>
-          <w:color w:val="1C1E21"/>
-          <w:sz w:val="22"/>
-        </w:rPr>
-        <w:t xml:space="preserve"> → </w:t>
-      </w:r>
-      <w:r>
-        <w:rPr>
-          <w:rFonts w:ascii="Consolas" w:hAnsi="Consolas"/>
-          <w:color w:val="1C1E21"/>
-          <w:sz w:val="20"/>
-        </w:rPr>
-        <w:t>0024_spark_app_id_and_secondary_key</w:t>
-      </w:r>
-      <w:r>
-        <w:rPr>
-          <w:color w:val="1C1E21"/>
-          <w:sz w:val="22"/>
-        </w:rPr>
-        <w:t xml:space="preserve"> → </w:t>
-      </w:r>
-      <w:r>
-        <w:rPr>
-          <w:rFonts w:ascii="Consolas" w:hAnsi="Consolas"/>
-          <w:color w:val="1C1E21"/>
-          <w:sz w:val="20"/>
-        </w:rPr>
-        <w:t>0025_scan_run_token_usage</w:t>
-      </w:r>
-      <w:r>
-        <w:rPr>
-          <w:color w:val="1C1E21"/>
-          <w:sz w:val="22"/>
-        </w:rPr>
-        <w:t xml:space="preserve"> → </w:t>
-      </w:r>
-      <w:r>
-        <w:rPr>
-          <w:rFonts w:ascii="Consolas" w:hAnsi="Consolas"/>
-          <w:color w:val="1C1E21"/>
-          <w:sz w:val="20"/>
-        </w:rPr>
-        <w:t>0026_finding_resource_permissions</w:t>
-      </w:r>
-      <w:r>
-        <w:rPr>
-          <w:color w:val="1C1E21"/>
-          <w:sz w:val="22"/>
-        </w:rPr>
-        <w:t xml:space="preserve"> → </w:t>
-      </w:r>
-      <w:r>
-        <w:rPr>
-          <w:rFonts w:ascii="Consolas" w:hAnsi="Consolas"/>
-          <w:color w:val="1C1E21"/>
-          <w:sz w:val="20"/>
-        </w:rPr>
-        <w:t>0027_business_rule_source</w:t>
-      </w:r>
-      <w:r>
-        <w:rPr>
-          <w:color w:val="1C1E21"/>
-          <w:sz w:val="22"/>
-        </w:rPr>
-        <w:t xml:space="preserve"> → </w:t>
-      </w:r>
-      <w:r>
-        <w:rPr>
-          <w:rFonts w:ascii="Consolas" w:hAnsi="Consolas"/>
-          <w:color w:val="1C1E21"/>
-          <w:sz w:val="20"/>
-        </w:rPr>
-        <w:t>0028_credential_privilege_rank</w:t>
-      </w:r>
-      <w:r>
-        <w:rPr>
-          <w:color w:val="1C1E21"/>
-          <w:sz w:val="22"/>
-        </w:rPr>
-        <w:t xml:space="preserve"> → </w:t>
-      </w:r>
-      <w:r>
-        <w:rPr>
-          <w:rFonts w:ascii="Consolas" w:hAnsi="Consolas"/>
-          <w:color w:val="1C1E21"/>
-          <w:sz w:val="20"/>
-        </w:rPr>
-        <w:t>0029_ai_provider_config_model_tiers</w:t>
-      </w:r>
-      <w:r>
-        <w:rPr>
-          <w:color w:val="1C1E21"/>
-          <w:sz w:val="22"/>
-        </w:rPr>
-        <w:t xml:space="preserve"> → </w:t>
-      </w:r>
-      <w:r>
-        <w:rPr>
-          <w:rFonts w:ascii="Consolas" w:hAnsi="Consolas"/>
-          <w:color w:val="1C1E21"/>
-          <w:sz w:val="20"/>
-        </w:rPr>
-        <w:t>0030_ai_provider_config_secret_rotated_at</w:t>
-      </w:r>
-      <w:r>
-        <w:rPr>
-          <w:color w:val="1C1E21"/>
-          <w:sz w:val="22"/>
-        </w:rPr>
-        <w:t xml:space="preserve"> → </w:t>
-      </w:r>
-      <w:r>
-        <w:rPr>
-          <w:rFonts w:ascii="Consolas" w:hAnsi="Consolas"/>
-          <w:color w:val="1C1E21"/>
-          <w:sz w:val="20"/>
-        </w:rPr>
-        <w:t>0031_drop_spark_specific_columns</w:t>
-      </w:r>
-      <w:r>
-        <w:rPr>
-          <w:color w:val="1C1E21"/>
-          <w:sz w:val="22"/>
-        </w:rPr>
-        <w:t xml:space="preserve"> → </w:t>
-      </w:r>
-      <w:r>
-        <w:rPr>
-          <w:rFonts w:ascii="Consolas" w:hAnsi="Consolas"/>
-          <w:color w:val="1C1E21"/>
-          <w:sz w:val="20"/>
-        </w:rPr>
-        <w:t>0032_drop_ai_provider_model_tiers</w:t>
-      </w:r>
-      <w:r>
-        <w:rPr>
-          <w:color w:val="1C1E21"/>
-          <w:sz w:val="22"/>
-        </w:rPr>
-        <w:t xml:space="preserve"> → </w:t>
-      </w:r>
-      <w:r>
-        <w:rPr>
-          <w:rFonts w:ascii="Consolas" w:hAnsi="Consolas"/>
-          <w:color w:val="1C1E21"/>
-          <w:sz w:val="20"/>
-        </w:rPr>
-        <w:t>0033_vgs_auto_seed_finding_memory</w:t>
-      </w:r>
-      <w:r>
-        <w:rPr>
-          <w:color w:val="1C1E21"/>
-          <w:sz w:val="22"/>
-        </w:rPr>
-        <w:t xml:space="preserve"> → </w:t>
-      </w:r>
-      <w:r>
-        <w:rPr>
-          <w:rFonts w:ascii="Consolas" w:hAnsi="Consolas"/>
-          <w:color w:val="1C1E21"/>
-          <w:sz w:val="20"/>
-        </w:rPr>
-        <w:t>0034_scope_entry_purpose</w:t>
-      </w:r>
-      <w:r>
-        <w:rPr>
-          <w:color w:val="1C1E21"/>
-          <w:sz w:val="22"/>
-        </w:rPr>
-        <w:t xml:space="preserve"> → </w:t>
-      </w:r>
-      <w:r>
-        <w:rPr>
-          <w:rFonts w:ascii="Consolas" w:hAnsi="Consolas"/>
-          <w:color w:val="1C1E21"/>
-          <w:sz w:val="20"/>
-        </w:rPr>
-        <w:t>0035_evidence_payload</w:t>
-      </w:r>
-      <w:r>
-        <w:rPr>
-          <w:color w:val="1C1E21"/>
-          <w:sz w:val="22"/>
-        </w:rPr>
-        <w:t>.</w:t>
+          <w:sz w:val="22"/>
+        </w:rPr>
+        <w:t>0001_initial_schema → 0001b_widen_alembic_version_column (widens alembic_version.version_num for this project's long revision slugs) → 0002_scan_findings_and_permissions → 0003_phase2_review_candidates_and_login_config → 0004_phase3_business_rules → 0005_phase4_login_macros → 0006_phase5_executive_summary → 0007_phase6_ai_provider_configs → 0008_phase6b_oidc_sso → 0009_phase6c_api_keys → 0010_phase8_retest_jobs → 0011_phase9_ticketing_and_notifications → 0012_phase10_cmdb_and_vgs → 0013_credential_extra_cookies → 0014_phase11_extensibility_and_lifecycle → 0015_saml_org_config → 0016_org_branding → 0017_vgs_report_builder → 0018_scan_delete_cascade_and_vgs_finding_link → 0019_vgs_evidence_cascade_and_auto_seed → 0020_scan_run_warning → 0021_credential_set_delete_cascade → 0022_drop_authorization_records (drops the table entirely) → 0023_ai_provider_config_default → 0024_spark_app_id_and_secondary_key → 0025_scan_run_token_usage → 0026_finding_resource_permissions → 0027_business_rule_source → 0028_credential_privilege_rank → 0029_ai_provider_config_model_tiers → 0030_ai_provider_config_secret_rotated_at → 0031_drop_spark_specific_columns → 0032_drop_ai_provider_model_tiers → 0033_vgs_auto_seed_finding_memory → 0034_scope_entry_purpose → 0035_evidence_payload → 0036_chatbot_targets → 0037_chatbot_agency_probes → 0038_credential_extra_headers.</w:t>
       </w:r>
     </w:p>
     <w:p>
       <w:r>
         <w:rPr>
-          <w:color w:val="1C1E21"/>
-          <w:sz w:val="22"/>
-        </w:rPr>
-        <w:t xml:space="preserve">Two of these pairs are worth reading together, not in isolation: </w:t>
-      </w:r>
-      <w:r>
-        <w:rPr>
-          <w:rFonts w:ascii="Consolas" w:hAnsi="Consolas"/>
-          <w:color w:val="1C1E21"/>
-          <w:sz w:val="20"/>
-        </w:rPr>
-        <w:t>0024</w:t>
-      </w:r>
-      <w:r>
-        <w:rPr>
-          <w:color w:val="1C1E21"/>
-          <w:sz w:val="22"/>
-        </w:rPr>
-        <w:t xml:space="preserve"> added columns for a since-removed, org-specific internal LLM gateway integration (never a general-purpose feature, and out of scope once that org's need went away); </w:t>
-      </w:r>
-      <w:r>
-        <w:rPr>
-          <w:rFonts w:ascii="Consolas" w:hAnsi="Consolas"/>
-          <w:color w:val="1C1E21"/>
-          <w:sz w:val="20"/>
-        </w:rPr>
-        <w:t>0031</w:t>
-      </w:r>
-      <w:r>
-        <w:rPr>
-          <w:color w:val="1C1E21"/>
-          <w:sz w:val="22"/>
-        </w:rPr>
-        <w:t xml:space="preserve"> drops them. </w:t>
-      </w:r>
-      <w:r>
-        <w:rPr>
-          <w:rFonts w:ascii="Consolas" w:hAnsi="Consolas"/>
-          <w:color w:val="1C1E21"/>
-          <w:sz w:val="20"/>
-        </w:rPr>
-        <w:t>0029</w:t>
-      </w:r>
-      <w:r>
-        <w:rPr>
-          <w:color w:val="1C1E21"/>
-          <w:sz w:val="22"/>
-        </w:rPr>
-        <w:t xml:space="preserve"> added per-agent-role model tiering (</w:t>
-      </w:r>
-      <w:r>
-        <w:rPr>
-          <w:rFonts w:ascii="Consolas" w:hAnsi="Consolas"/>
-          <w:color w:val="1C1E21"/>
-          <w:sz w:val="20"/>
-        </w:rPr>
-        <w:t>model_reasoning</w:t>
-      </w:r>
-      <w:r>
-        <w:rPr>
-          <w:color w:val="1C1E21"/>
-          <w:sz w:val="22"/>
-        </w:rPr>
-        <w:t>/</w:t>
-      </w:r>
-      <w:r>
-        <w:rPr>
-          <w:rFonts w:ascii="Consolas" w:hAnsi="Consolas"/>
-          <w:color w:val="1C1E21"/>
-          <w:sz w:val="20"/>
-        </w:rPr>
-        <w:t>model_classification</w:t>
-      </w:r>
-      <w:r>
-        <w:rPr>
-          <w:color w:val="1C1E21"/>
-          <w:sz w:val="22"/>
-        </w:rPr>
-        <w:t xml:space="preserve"> columns, letting an org route different agents to different models); </w:t>
-      </w:r>
-      <w:r>
-        <w:rPr>
-          <w:rFonts w:ascii="Consolas" w:hAnsi="Consolas"/>
-          <w:color w:val="1C1E21"/>
-          <w:sz w:val="20"/>
-        </w:rPr>
-        <w:t>0032</w:t>
-      </w:r>
-      <w:r>
-        <w:rPr>
-          <w:color w:val="1C1E21"/>
-          <w:sz w:val="22"/>
-        </w:rPr>
-        <w:t xml:space="preserve"> drops it, in favor of the single-configured-model design described in §1/§6 — real functionality that shipped, was used, and was deliberately simplified back out once it proved to be complexity without enough benefit, not a mistake papered over (§6.2/§18 item 17 covers the second, schema-free attempt that replaced it). </w:t>
-      </w:r>
-      <w:r>
-        <w:rPr>
-          <w:rFonts w:ascii="Consolas" w:hAnsi="Consolas"/>
-          <w:color w:val="1C1E21"/>
-          <w:sz w:val="20"/>
-        </w:rPr>
-        <w:t>0033</w:t>
-      </w:r>
-      <w:r>
-        <w:rPr>
-          <w:color w:val="1C1E21"/>
-          <w:sz w:val="22"/>
-        </w:rPr>
-        <w:t xml:space="preserve"> tracks a persistent </w:t>
-      </w:r>
-      <w:r>
-        <w:rPr>
-          <w:rFonts w:ascii="Consolas" w:hAnsi="Consolas"/>
-          <w:color w:val="1C1E21"/>
-          <w:sz w:val="20"/>
-        </w:rPr>
-        <w:t>auto_seeded_finding_ids</w:t>
-      </w:r>
-      <w:r>
-        <w:rPr>
-          <w:color w:val="1C1E21"/>
-          <w:sz w:val="22"/>
-        </w:rPr>
-        <w:t xml:space="preserve"> column on </w:t>
-      </w:r>
-      <w:r>
-        <w:rPr>
-          <w:rFonts w:ascii="Consolas" w:hAnsi="Consolas"/>
-          <w:color w:val="1C1E21"/>
-          <w:sz w:val="20"/>
-        </w:rPr>
-        <w:t>VgsReportDraft</w:t>
-      </w:r>
-      <w:r>
-        <w:rPr>
-          <w:color w:val="1C1E21"/>
-          <w:sz w:val="22"/>
-        </w:rPr>
-        <w:t xml:space="preserve"> (§10) that records every </w:t>
-      </w:r>
-      <w:r>
-        <w:rPr>
-          <w:rFonts w:ascii="Consolas" w:hAnsi="Consolas"/>
-          <w:color w:val="1C1E21"/>
-          <w:sz w:val="20"/>
-        </w:rPr>
-        <w:t>Finding.id</w:t>
-      </w:r>
-      <w:r>
-        <w:rPr>
-          <w:color w:val="1C1E21"/>
-          <w:sz w:val="22"/>
-        </w:rPr>
-        <w:t xml:space="preserve"> an auto-seed pass has ever offered a report draft, independent of whether the resulting vulnerability still exists in the draft. </w:t>
-      </w:r>
-      <w:r>
-        <w:rPr>
-          <w:rFonts w:ascii="Consolas" w:hAnsi="Consolas"/>
-          <w:color w:val="1C1E21"/>
-          <w:sz w:val="20"/>
-        </w:rPr>
-        <w:t>0034</w:t>
-      </w:r>
-      <w:r>
-        <w:rPr>
-          <w:color w:val="1C1E21"/>
-          <w:sz w:val="22"/>
-        </w:rPr>
-        <w:t xml:space="preserve"> and </w:t>
-      </w:r>
-      <w:r>
-        <w:rPr>
-          <w:rFonts w:ascii="Consolas" w:hAnsi="Consolas"/>
-          <w:color w:val="1C1E21"/>
-          <w:sz w:val="20"/>
-        </w:rPr>
-        <w:t>0035</w:t>
-      </w:r>
-      <w:r>
-        <w:rPr>
-          <w:color w:val="1C1E21"/>
-          <w:sz w:val="22"/>
-        </w:rPr>
-        <w:t xml:space="preserve"> are the newest: </w:t>
-      </w:r>
-      <w:r>
-        <w:rPr>
-          <w:rFonts w:ascii="Consolas" w:hAnsi="Consolas"/>
-          <w:color w:val="1C1E21"/>
-          <w:sz w:val="20"/>
-        </w:rPr>
-        <w:t>scope_entries.purpose</w:t>
-      </w:r>
-      <w:r>
-        <w:rPr>
-          <w:color w:val="1C1E21"/>
-          <w:sz w:val="22"/>
-        </w:rPr>
-        <w:t xml:space="preserve"> (</w:t>
-      </w:r>
-      <w:r>
-        <w:rPr>
-          <w:rFonts w:ascii="Consolas" w:hAnsi="Consolas"/>
-          <w:color w:val="1C1E21"/>
-          <w:sz w:val="20"/>
-        </w:rPr>
-        <w:t>"target"</w:t>
-      </w:r>
-      <w:r>
-        <w:rPr>
-          <w:color w:val="1C1E21"/>
-          <w:sz w:val="22"/>
-        </w:rPr>
-        <w:t xml:space="preserve"> vs. </w:t>
-      </w:r>
-      <w:r>
-        <w:rPr>
-          <w:rFonts w:ascii="Consolas" w:hAnsi="Consolas"/>
-          <w:color w:val="1C1E21"/>
-          <w:sz w:val="20"/>
-        </w:rPr>
-        <w:t>"login_only"</w:t>
-      </w:r>
-      <w:r>
-        <w:rPr>
-          <w:color w:val="1C1E21"/>
-          <w:sz w:val="22"/>
-        </w:rPr>
-        <w:t xml:space="preserve">, §5.5's IdP scope-leak fix) and </w:t>
-      </w:r>
-      <w:r>
-        <w:rPr>
-          <w:rFonts w:ascii="Consolas" w:hAnsi="Consolas"/>
-          <w:color w:val="1C1E21"/>
-          <w:sz w:val="20"/>
-        </w:rPr>
-        <w:t>evidence.payload</w:t>
-      </w:r>
-      <w:r>
-        <w:rPr>
-          <w:color w:val="1C1E21"/>
-          <w:sz w:val="22"/>
-        </w:rPr>
-        <w:t xml:space="preserve"> (§9's highlighted-substring evidence), both additive and nullable/defaulted, so neither required a backfill.</w:t>
+          <w:sz w:val="22"/>
+        </w:rPr>
+        <w:t>Two of these pairs are worth reading together, not in isolation: 0024 added columns for a since-removed, org-specific internal LLM gateway integration (never a general-purpose feature, and out of scope once that org's need went away); 0031 drops them. 0029 added per-agent-role model tiering (model_reasoning/model_classification columns, letting an org route different agents to different models); 0032 drops it, in favor of the single-configured-model design described in §1/§6 — real functionality that shipped, was used, and was deliberately simplified back out once it proved to be complexity without enough benefit, not a mistake papered over (§6.2/§18 item 17 covers the second, schema-free attempt that replaced it). 0033 tracks a persistent auto_seeded_finding_ids column on VgsReportDraft (§10) that records every Finding.id an auto-seed pass has ever offered a report draft, independent of whether the resulting vulnerability still exists in the draft. 0034 and 0035 are the newest before this round: scope_entries.purpose ("target" vs. "login_only", §5.5's IdP scope-leak fix) and evidence.payload (§9's highlighted-substring evidence), both additive and nullable/defaulted, so neither required a backfill. 0036 and 0037 add the Chatbot/LLM Pentest capability's two tables (§4/§7): chatbot_targets and chatbot_agency_probes, both additive, no RBAC seed needed in 0037 since it's a sub-resource of chatbot_target (0036 already seeds that). 0038 adds credential_sets.extra_headers — the header-shaped equivalent of extra_cookies, also additive and nullable.</w:t>
       </w:r>
     </w:p>
     <w:p>
@@ -17897,378 +18131,9 @@
     <w:p>
       <w:r>
         <w:rPr>
-          <w:b/>
-          <w:color w:val="1C1E21"/>
-          <w:sz w:val="22"/>
-        </w:rPr>
-        <w:t>20 resources</w:t>
-      </w:r>
-      <w:r>
-        <w:rPr>
-          <w:color w:val="1C1E21"/>
-          <w:sz w:val="22"/>
-        </w:rPr>
-        <w:t xml:space="preserve">: </w:t>
-      </w:r>
-      <w:r>
-        <w:rPr>
-          <w:rFonts w:ascii="Consolas" w:hAnsi="Consolas"/>
-          <w:color w:val="1C1E21"/>
-          <w:sz w:val="20"/>
-        </w:rPr>
-        <w:t>organization</w:t>
-      </w:r>
-      <w:r>
-        <w:rPr>
-          <w:color w:val="1C1E21"/>
-          <w:sz w:val="22"/>
-        </w:rPr>
-        <w:t xml:space="preserve">, </w:t>
-      </w:r>
-      <w:r>
-        <w:rPr>
-          <w:rFonts w:ascii="Consolas" w:hAnsi="Consolas"/>
-          <w:color w:val="1C1E21"/>
-          <w:sz w:val="20"/>
-        </w:rPr>
-        <w:t>project</w:t>
-      </w:r>
-      <w:r>
-        <w:rPr>
-          <w:color w:val="1C1E21"/>
-          <w:sz w:val="22"/>
-        </w:rPr>
-        <w:t xml:space="preserve">, </w:t>
-      </w:r>
-      <w:r>
-        <w:rPr>
-          <w:rFonts w:ascii="Consolas" w:hAnsi="Consolas"/>
-          <w:color w:val="1C1E21"/>
-          <w:sz w:val="20"/>
-        </w:rPr>
-        <w:t>version</w:t>
-      </w:r>
-      <w:r>
-        <w:rPr>
-          <w:color w:val="1C1E21"/>
-          <w:sz w:val="22"/>
-        </w:rPr>
-        <w:t xml:space="preserve">, </w:t>
-      </w:r>
-      <w:r>
-        <w:rPr>
-          <w:rFonts w:ascii="Consolas" w:hAnsi="Consolas"/>
-          <w:color w:val="1C1E21"/>
-          <w:sz w:val="20"/>
-        </w:rPr>
-        <w:t>target</w:t>
-      </w:r>
-      <w:r>
-        <w:rPr>
-          <w:color w:val="1C1E21"/>
-          <w:sz w:val="22"/>
-        </w:rPr>
-        <w:t xml:space="preserve">, </w:t>
-      </w:r>
-      <w:r>
-        <w:rPr>
-          <w:rFonts w:ascii="Consolas" w:hAnsi="Consolas"/>
-          <w:color w:val="1C1E21"/>
-          <w:sz w:val="20"/>
-        </w:rPr>
-        <w:t>credential</w:t>
-      </w:r>
-      <w:r>
-        <w:rPr>
-          <w:color w:val="1C1E21"/>
-          <w:sz w:val="22"/>
-        </w:rPr>
-        <w:t xml:space="preserve">, </w:t>
-      </w:r>
-      <w:r>
-        <w:rPr>
-          <w:rFonts w:ascii="Consolas" w:hAnsi="Consolas"/>
-          <w:color w:val="1C1E21"/>
-          <w:sz w:val="20"/>
-        </w:rPr>
-        <w:t>traffic</w:t>
-      </w:r>
-      <w:r>
-        <w:rPr>
-          <w:color w:val="1C1E21"/>
-          <w:sz w:val="22"/>
-        </w:rPr>
-        <w:t xml:space="preserve">, </w:t>
-      </w:r>
-      <w:r>
-        <w:rPr>
-          <w:rFonts w:ascii="Consolas" w:hAnsi="Consolas"/>
-          <w:color w:val="1C1E21"/>
-          <w:sz w:val="20"/>
-        </w:rPr>
-        <w:t>scan</w:t>
-      </w:r>
-      <w:r>
-        <w:rPr>
-          <w:color w:val="1C1E21"/>
-          <w:sz w:val="22"/>
-        </w:rPr>
-        <w:t xml:space="preserve">, </w:t>
-      </w:r>
-      <w:r>
-        <w:rPr>
-          <w:rFonts w:ascii="Consolas" w:hAnsi="Consolas"/>
-          <w:color w:val="1C1E21"/>
-          <w:sz w:val="20"/>
-        </w:rPr>
-        <w:t>finding</w:t>
-      </w:r>
-      <w:r>
-        <w:rPr>
-          <w:color w:val="1C1E21"/>
-          <w:sz w:val="22"/>
-        </w:rPr>
-        <w:t xml:space="preserve">, </w:t>
-      </w:r>
-      <w:r>
-        <w:rPr>
-          <w:rFonts w:ascii="Consolas" w:hAnsi="Consolas"/>
-          <w:color w:val="1C1E21"/>
-          <w:sz w:val="20"/>
-        </w:rPr>
-        <w:t>review_candidate</w:t>
-      </w:r>
-      <w:r>
-        <w:rPr>
-          <w:color w:val="1C1E21"/>
-          <w:sz w:val="22"/>
-        </w:rPr>
-        <w:t xml:space="preserve">, </w:t>
-      </w:r>
-      <w:r>
-        <w:rPr>
-          <w:rFonts w:ascii="Consolas" w:hAnsi="Consolas"/>
-          <w:color w:val="1C1E21"/>
-          <w:sz w:val="20"/>
-        </w:rPr>
-        <w:t>business_rule</w:t>
-      </w:r>
-      <w:r>
-        <w:rPr>
-          <w:color w:val="1C1E21"/>
-          <w:sz w:val="22"/>
-        </w:rPr>
-        <w:t xml:space="preserve">, </w:t>
-      </w:r>
-      <w:r>
-        <w:rPr>
-          <w:rFonts w:ascii="Consolas" w:hAnsi="Consolas"/>
-          <w:color w:val="1C1E21"/>
-          <w:sz w:val="20"/>
-        </w:rPr>
-        <w:t>ai_provider_config</w:t>
-      </w:r>
-      <w:r>
-        <w:rPr>
-          <w:color w:val="1C1E21"/>
-          <w:sz w:val="22"/>
-        </w:rPr>
-        <w:t xml:space="preserve">, </w:t>
-      </w:r>
-      <w:r>
-        <w:rPr>
-          <w:rFonts w:ascii="Consolas" w:hAnsi="Consolas"/>
-          <w:color w:val="1C1E21"/>
-          <w:sz w:val="20"/>
-        </w:rPr>
-        <w:t>oidc_provider_config</w:t>
-      </w:r>
-      <w:r>
-        <w:rPr>
-          <w:color w:val="1C1E21"/>
-          <w:sz w:val="22"/>
-        </w:rPr>
-        <w:t xml:space="preserve">, </w:t>
-      </w:r>
-      <w:r>
-        <w:rPr>
-          <w:rFonts w:ascii="Consolas" w:hAnsi="Consolas"/>
-          <w:color w:val="1C1E21"/>
-          <w:sz w:val="20"/>
-        </w:rPr>
-        <w:t>notification_config</w:t>
-      </w:r>
-      <w:r>
-        <w:rPr>
-          <w:color w:val="1C1E21"/>
-          <w:sz w:val="22"/>
-        </w:rPr>
-        <w:t xml:space="preserve">, </w:t>
-      </w:r>
-      <w:r>
-        <w:rPr>
-          <w:rFonts w:ascii="Consolas" w:hAnsi="Consolas"/>
-          <w:color w:val="1C1E21"/>
-          <w:sz w:val="20"/>
-        </w:rPr>
-        <w:t>ticketing_config</w:t>
-      </w:r>
-      <w:r>
-        <w:rPr>
-          <w:color w:val="1C1E21"/>
-          <w:sz w:val="22"/>
-        </w:rPr>
-        <w:t xml:space="preserve">, </w:t>
-      </w:r>
-      <w:r>
-        <w:rPr>
-          <w:rFonts w:ascii="Consolas" w:hAnsi="Consolas"/>
-          <w:color w:val="1C1E21"/>
-          <w:sz w:val="20"/>
-        </w:rPr>
-        <w:t>cmdb_config</w:t>
-      </w:r>
-      <w:r>
-        <w:rPr>
-          <w:color w:val="1C1E21"/>
-          <w:sz w:val="22"/>
-        </w:rPr>
-        <w:t xml:space="preserve">, </w:t>
-      </w:r>
-      <w:r>
-        <w:rPr>
-          <w:rFonts w:ascii="Consolas" w:hAnsi="Consolas"/>
-          <w:color w:val="1C1E21"/>
-          <w:sz w:val="20"/>
-        </w:rPr>
-        <w:t>vgs_config</w:t>
-      </w:r>
-      <w:r>
-        <w:rPr>
-          <w:color w:val="1C1E21"/>
-          <w:sz w:val="22"/>
-        </w:rPr>
-        <w:t xml:space="preserve">, </w:t>
-      </w:r>
-      <w:r>
-        <w:rPr>
-          <w:rFonts w:ascii="Consolas" w:hAnsi="Consolas"/>
-          <w:color w:val="1C1E21"/>
-          <w:sz w:val="20"/>
-        </w:rPr>
-        <w:t>user</w:t>
-      </w:r>
-      <w:r>
-        <w:rPr>
-          <w:color w:val="1C1E21"/>
-          <w:sz w:val="22"/>
-        </w:rPr>
-        <w:t xml:space="preserve">, </w:t>
-      </w:r>
-      <w:r>
-        <w:rPr>
-          <w:rFonts w:ascii="Consolas" w:hAnsi="Consolas"/>
-          <w:color w:val="1C1E21"/>
-          <w:sz w:val="20"/>
-        </w:rPr>
-        <w:t>org_branding</w:t>
-      </w:r>
-      <w:r>
-        <w:rPr>
-          <w:color w:val="1C1E21"/>
-          <w:sz w:val="22"/>
-        </w:rPr>
-        <w:t xml:space="preserve">, </w:t>
-      </w:r>
-      <w:r>
-        <w:rPr>
-          <w:rFonts w:ascii="Consolas" w:hAnsi="Consolas"/>
-          <w:color w:val="1C1E21"/>
-          <w:sz w:val="20"/>
-        </w:rPr>
-        <w:t>saml_config</w:t>
-      </w:r>
-      <w:r>
-        <w:rPr>
-          <w:color w:val="1C1E21"/>
-          <w:sz w:val="22"/>
-        </w:rPr>
-        <w:t xml:space="preserve">, </w:t>
-      </w:r>
-      <w:r>
-        <w:rPr>
-          <w:rFonts w:ascii="Consolas" w:hAnsi="Consolas"/>
-          <w:color w:val="1C1E21"/>
-          <w:sz w:val="20"/>
-        </w:rPr>
-        <w:t>vgs_vulnerability</w:t>
-      </w:r>
-      <w:r>
-        <w:rPr>
-          <w:color w:val="1C1E21"/>
-          <w:sz w:val="22"/>
-        </w:rPr>
-        <w:t xml:space="preserve"> — each with </w:t>
-      </w:r>
-      <w:r>
-        <w:rPr>
-          <w:rFonts w:ascii="Consolas" w:hAnsi="Consolas"/>
-          <w:color w:val="1C1E21"/>
-          <w:sz w:val="20"/>
-        </w:rPr>
-        <w:t>create</w:t>
-      </w:r>
-      <w:r>
-        <w:rPr>
-          <w:color w:val="1C1E21"/>
-          <w:sz w:val="22"/>
-        </w:rPr>
-        <w:t>/</w:t>
-      </w:r>
-      <w:r>
-        <w:rPr>
-          <w:rFonts w:ascii="Consolas" w:hAnsi="Consolas"/>
-          <w:color w:val="1C1E21"/>
-          <w:sz w:val="20"/>
-        </w:rPr>
-        <w:t>read</w:t>
-      </w:r>
-      <w:r>
-        <w:rPr>
-          <w:color w:val="1C1E21"/>
-          <w:sz w:val="22"/>
-        </w:rPr>
-        <w:t>/</w:t>
-      </w:r>
-      <w:r>
-        <w:rPr>
-          <w:rFonts w:ascii="Consolas" w:hAnsi="Consolas"/>
-          <w:color w:val="1C1E21"/>
-          <w:sz w:val="20"/>
-        </w:rPr>
-        <w:t>update</w:t>
-      </w:r>
-      <w:r>
-        <w:rPr>
-          <w:color w:val="1C1E21"/>
-          <w:sz w:val="22"/>
-        </w:rPr>
-        <w:t>/</w:t>
-      </w:r>
-      <w:r>
-        <w:rPr>
-          <w:rFonts w:ascii="Consolas" w:hAnsi="Consolas"/>
-          <w:color w:val="1C1E21"/>
-          <w:sz w:val="20"/>
-        </w:rPr>
-        <w:t>delete</w:t>
-      </w:r>
-      <w:r>
-        <w:rPr>
-          <w:color w:val="1C1E21"/>
-          <w:sz w:val="22"/>
-        </w:rPr>
-        <w:t>.</w:t>
+          <w:sz w:val="22"/>
+        </w:rPr>
+        <w:t>21 resources: organization, project, version, target, credential, traffic, scan, finding, review_candidate, business_rule, ai_provider_config, oidc_provider_config, notification_config, ticketing_config, cmdb_config, vgs_config, user, org_branding, saml_config, vgs_vulnerability, chatbot_target — each with create/read/update/delete. chatbot_agency_probe rows are a sub-resource of chatbot_target (same pattern VgsEvidenceStep uses for vgs_vulnerability) — no separate resource.</w:t>
       </w:r>
     </w:p>
     <w:tbl>
@@ -18344,11 +18209,12 @@
             <w:tcW w:type="dxa" w:w="4320"/>
           </w:tcPr>
           <w:p>
-            <w:r>
-              <w:rPr>
-                <w:sz w:val="18"/>
-              </w:rPr>
-              <w:t>Full CRUD on all 20 resources</w:t>
+            <w:r/>
+            <w:r>
+              <w:rPr>
+                <w:sz w:val="22"/>
+              </w:rPr>
+              <w:t>Full CRUD on all 21 resources</w:t>
             </w:r>
           </w:p>
         </w:tc>
@@ -18711,16 +18577,9 @@
       </w:pPr>
       <w:r>
         <w:rPr>
-          <w:b/>
-          <w:sz w:val="22"/>
-        </w:rPr>
-        <w:t>Version detail tabs</w:t>
-      </w:r>
-      <w:r>
-        <w:rPr>
-          <w:sz w:val="22"/>
-        </w:rPr>
-        <w:t>: Burp, Business Rules, Credentials, Macro Recording, Scan Runs, Scope, Targets, Traffic — plus dedicated business-rule sub-forms (Credential Select, HTTP Method Select, Price/Quantity Tampering, Race Condition, Resource Isolation, Workflow Order) and VGS report sub-tabs (Evidence, Generate, Project Info, Vulnerabilities).</w:t>
+          <w:sz w:val="22"/>
+        </w:rPr>
+        <w:t>Version detail tabs: Burp, Business Rules, Chatbot Targets, Credentials, Macro Recording, Scan Runs, Scope, Targets, Traffic — plus dedicated business-rule sub-forms (Credential Select, HTTP Method Select, Price/Quantity Tampering, Race Condition, Resource Isolation, Workflow Order), a nested Agency Probes section under each chatbot target (§4/§7), and VGS report sub-tabs (Evidence, Generate, Project Info, Vulnerabilities).</w:t>
       </w:r>
     </w:p>
     <w:p>
@@ -18729,21 +18588,13 @@
       </w:pPr>
       <w:r>
         <w:rPr>
-          <w:b/>
-          <w:sz w:val="22"/>
-        </w:rPr>
-        <w:t>API client</w:t>
-      </w:r>
-      <w:r>
-        <w:rPr>
-          <w:sz w:val="22"/>
-        </w:rPr>
-        <w:t xml:space="preserve">: </w:t>
+          <w:sz w:val="22"/>
+        </w:rPr>
+        <w:t xml:space="preserve">API client: </w:t>
       </w:r>
       <w:r>
         <w:rPr>
           <w:rFonts w:ascii="Consolas" w:hAnsi="Consolas"/>
-          <w:color w:val="8A2BE2"/>
           <w:sz w:val="20"/>
         </w:rPr>
         <w:t>src/api/client.ts</w:t>
@@ -18752,12 +18603,11 @@
         <w:rPr>
           <w:sz w:val="22"/>
         </w:rPr>
-        <w:t xml:space="preserve"> exposes 23 namespaced sub-objects (auth, organizations, projects, users, versions, targets, credentials, businessRules, scanRuns, retestJobs, reviewCandidates, apiKeys, aiProviderConfigs, traffic, burp, notificationConfigs, ticketingConfigs, findingTickets, cmdbConfigs, vgsConfigs, samlConfigs, orgBranding, attackChains, oidcProviderConfigs); </w:t>
+        <w:t xml:space="preserve"> exposes 28 namespaced sub-objects (auth, organizations, projects, users, versions, targets, credentials, businessRules, scanRuns, retestJobs, reviewCandidates, apiKeys, aiProviderConfigs, traffic, burp, notificationConfigs, ticketingConfigs, findingTickets, cmdbConfigs, vgsConfigs, samlConfigs, orgBranding, attackChains, oidcProviderConfigs, chatbotTargets, chatbotAgencyProbes, among others); </w:t>
       </w:r>
       <w:r>
         <w:rPr>
           <w:rFonts w:ascii="Consolas" w:hAnsi="Consolas"/>
-          <w:color w:val="8A2BE2"/>
           <w:sz w:val="20"/>
         </w:rPr>
         <w:t>src/api/types.ts</w:t>
@@ -18766,7 +18616,7 @@
         <w:rPr>
           <w:sz w:val="22"/>
         </w:rPr>
-        <w:t xml:space="preserve"> defines 62 exported types.</w:t>
+        <w:t xml:space="preserve"> defines 67 exported types.</w:t>
       </w:r>
     </w:p>
     <w:p>
@@ -19210,6 +19060,165 @@
           <w:sz w:val="22"/>
         </w:rPr>
         <w:t xml:space="preserve"> it means anything in context. AI's output is never trusted outright; it's gated by more determinism at every step (re-execution, adversarial validation, the same detection pipeline an analyst's own hand-typed business rule goes through). A finding only exists where both layers agree, twice.</w:t>
+      </w:r>
+    </w:p>
+    <w:p>
+      <w:r>
+        <w:rPr>
+          <w:b/>
+          <w:sz w:val="22"/>
+        </w:rPr>
+        <w:t>Can Verdikt test a chatbot or an LLM-backed application, not just a web app/API?</w:t>
+      </w:r>
+      <w:r>
+        <w:rPr>
+          <w:sz w:val="22"/>
+        </w:rPr>
+        <w:t xml:space="preserve"> </w:t>
+      </w:r>
+      <w:r>
+        <w:rPr>
+          <w:sz w:val="22"/>
+        </w:rPr>
+        <w:t xml:space="preserve">Yes — an analyst configures a </w:t>
+      </w:r>
+      <w:r>
+        <w:rPr>
+          <w:rFonts w:ascii="Consolas" w:hAnsi="Consolas"/>
+          <w:sz w:val="20"/>
+        </w:rPr>
+        <w:t>ChatbotTarget</w:t>
+      </w:r>
+      <w:r>
+        <w:rPr>
+          <w:sz w:val="22"/>
+        </w:rPr>
+        <w:t xml:space="preserve"> (endpoint URL, HTTP method, a request body template with a </w:t>
+      </w:r>
+      <w:r>
+        <w:rPr>
+          <w:rFonts w:ascii="Consolas" w:hAnsi="Consolas"/>
+          <w:sz w:val="20"/>
+        </w:rPr>
+        <w:t>{message}</w:t>
+      </w:r>
+      <w:r>
+        <w:rPr>
+          <w:sz w:val="22"/>
+        </w:rPr>
+        <w:t xml:space="preserve"> placeholder, and where to read the reply text out of the JSON response), optionally with one or more </w:t>
+      </w:r>
+      <w:r>
+        <w:rPr>
+          <w:rFonts w:ascii="Consolas" w:hAnsi="Consolas"/>
+          <w:sz w:val="20"/>
+        </w:rPr>
+        <w:t>ChatbotAgencyProbe</w:t>
+      </w:r>
+      <w:r>
+        <w:rPr>
+          <w:sz w:val="22"/>
+        </w:rPr>
+        <w:t xml:space="preserve"> rows describing an action the bot should never agree to perform. </w:t>
+      </w:r>
+      <w:r>
+        <w:rPr>
+          <w:rFonts w:ascii="Consolas" w:hAnsi="Consolas"/>
+          <w:sz w:val="20"/>
+        </w:rPr>
+        <w:t>ChatbotInjectionAgent</w:t>
+      </w:r>
+      <w:r>
+        <w:rPr>
+          <w:sz w:val="22"/>
+        </w:rPr>
+        <w:t xml:space="preserve"> (§7) then runs five checks against it covering the OWASP LLM Top 10 2026 and Agentic Top 10 2026: direct prompt injection, system-prompt/hidden-context extraction, improper output handling (unescaped reflection back into the bot's own reply), excessive agency (talked into agreeing to a forbidden action), and unexpected code execution. This is a fully conversational check — Verdikt only ever sends the bot a message and judges the reply text, the same safety envelope as every other AI-judged check in this system.</w:t>
+      </w:r>
+    </w:p>
+    <w:p>
+      <w:r>
+        <w:rPr>
+          <w:b/>
+          <w:sz w:val="22"/>
+        </w:rPr>
+        <w:t>Can I save a custom auth header on a credential, not just a bearer token or cookie?</w:t>
+      </w:r>
+      <w:r>
+        <w:rPr>
+          <w:sz w:val="22"/>
+        </w:rPr>
+        <w:t xml:space="preserve"> </w:t>
+      </w:r>
+      <w:r>
+        <w:rPr>
+          <w:sz w:val="22"/>
+        </w:rPr>
+        <w:t xml:space="preserve">Yes — </w:t>
+      </w:r>
+      <w:r>
+        <w:rPr>
+          <w:rFonts w:ascii="Consolas" w:hAnsi="Consolas"/>
+          <w:sz w:val="20"/>
+        </w:rPr>
+        <w:t>CredentialSet.extra_headers</w:t>
+      </w:r>
+      <w:r>
+        <w:rPr>
+          <w:sz w:val="22"/>
+        </w:rPr>
+        <w:t xml:space="preserve"> (§4) is a JSON map of static headers (e.g. </w:t>
+      </w:r>
+      <w:r>
+        <w:rPr>
+          <w:rFonts w:ascii="Consolas" w:hAnsi="Consolas"/>
+          <w:sz w:val="20"/>
+        </w:rPr>
+        <w:t>X-API-Key: &lt;value&gt;</w:t>
+      </w:r>
+      <w:r>
+        <w:rPr>
+          <w:sz w:val="22"/>
+        </w:rPr>
+        <w:t xml:space="preserve">) forced onto every request for that credential, the header-shaped equivalent of the pre-existing </w:t>
+      </w:r>
+      <w:r>
+        <w:rPr>
+          <w:rFonts w:ascii="Consolas" w:hAnsi="Consolas"/>
+          <w:sz w:val="20"/>
+        </w:rPr>
+        <w:t>extra_cookies</w:t>
+      </w:r>
+      <w:r>
+        <w:rPr>
+          <w:sz w:val="22"/>
+        </w:rPr>
+        <w:t xml:space="preserve">. It applies on top of any credential type — an </w:t>
+      </w:r>
+      <w:r>
+        <w:rPr>
+          <w:rFonts w:ascii="Consolas" w:hAnsi="Consolas"/>
+          <w:sz w:val="20"/>
+        </w:rPr>
+        <w:t>api_token</w:t>
+      </w:r>
+      <w:r>
+        <w:rPr>
+          <w:sz w:val="22"/>
+        </w:rPr>
+        <w:t xml:space="preserve"> credential (which otherwise only ever produces a literal </w:t>
+      </w:r>
+      <w:r>
+        <w:rPr>
+          <w:rFonts w:ascii="Consolas" w:hAnsi="Consolas"/>
+          <w:sz w:val="20"/>
+        </w:rPr>
+        <w:t>Authorization: Bearer &lt;token&gt;</w:t>
+      </w:r>
+      <w:r>
+        <w:rPr>
+          <w:sz w:val="22"/>
+        </w:rPr>
+        <w:t>), a form login, or a recorded macro — so an imported Postman/API collection's custom auth header can be saved and reused for API scans alongside, not instead of, a normal login flow.</w:t>
       </w:r>
     </w:p>
     <w:p>

</xml_diff>